<commit_message>
Report layout - first shot
</commit_message>
<xml_diff>
--- a/src/Layers/W1/BaseApp/Finance/SpendRequest/SpendRequestDocument.docx
+++ b/src/Layers/W1/BaseApp/Finance/SpendRequest/SpendRequestDocument.docx
@@ -9,8 +9,8 @@
       <w:sdt>
         <w:sdtPr>
           <w:alias w:val="ReportLbl"/>
-          <w:tag w:val="#BC:InsertDataItem,Labels/ReportLbl"/>
-          <w:id w:val="1238134959"/>
+          <w:tag w:val="#BC:InsertDataItem,DataItems/SpendRequest/ReportLbl"/>
+          <w:id w:val="739986111"/>
           <w:placeholder>
             <w:docPart w:val="DefaultPlaceholder_-1854013440"/>
           </w:placeholder>
@@ -53,12 +53,12 @@
         <w:tblStyle w:val="TableGrid"/>
         <w:tblW w:w="9643" w:type="dxa"/>
         <w:tblBorders>
-          <w:top w:val="none" w:sz="0" w:space="0" w:color="auto"/>
-          <w:left w:val="none" w:sz="0" w:space="0" w:color="auto"/>
-          <w:bottom w:val="none" w:sz="0" w:space="0" w:color="auto"/>
-          <w:right w:val="none" w:sz="0" w:space="0" w:color="auto"/>
-          <w:insideH w:val="none" w:sz="0" w:space="0" w:color="auto"/>
-          <w:insideV w:val="none" w:sz="0" w:space="0" w:color="auto"/>
+          <w:top w:val="none" w:color="auto" w:sz="0" w:space="0"/>
+          <w:left w:val="none" w:color="auto" w:sz="0" w:space="0"/>
+          <w:bottom w:val="none" w:color="auto" w:sz="0" w:space="0"/>
+          <w:right w:val="none" w:color="auto" w:sz="0" w:space="0"/>
+          <w:insideH w:val="none" w:color="auto" w:sz="0" w:space="0"/>
+          <w:insideV w:val="none" w:color="auto" w:sz="0" w:space="0"/>
         </w:tblBorders>
         <w:tblLayout w:type="fixed"/>
         <w:tblLook w:val="04A0" w:firstRow="1" w:lastRow="0" w:firstColumn="1" w:lastColumn="0" w:noHBand="0" w:noVBand="1"/>
@@ -578,12 +578,11 @@
     <w:sdt>
       <w:sdtPr>
         <w:alias w:val="DetailsHeaderLbl"/>
-        <w:tag w:val="#BC:InsertDataItem,Labels/DetailsHeaderLbl"/>
-        <w:id w:val="1976107953"/>
+        <w:tag w:val="#BC:InsertDataItem,DataItems/SpendRequest/DetailsHeaderLbl"/>
+        <w:id w:val="-1105646606"/>
         <w:placeholder>
           <w:docPart w:val="DefaultPlaceholder_-1854013440"/>
         </w:placeholder>
-        <w:dataBinding w:prefixMappings="&lt;xmlns:ns0='urn:microsoft-dynamics-nav/reports/Spend_Request_Document/6850/' " w:xpath="/ns0:NavWordReportXmlPart[1]/ns0:Labels[1]/ns0:DetailsHeaderLbl[1]" w:storeItemID="{00000000-0000-0000-0000-000000000000}"/>
         <w15:color w:val="808080"/>
         <w:text/>
       </w:sdtPr>
@@ -605,12 +604,12 @@
         <w:tblStyle w:val="GridTable1Light"/>
         <w:tblW w:w="0" w:type="auto"/>
         <w:tblBorders>
-          <w:top w:val="none" w:sz="0" w:space="0" w:color="auto"/>
-          <w:left w:val="none" w:sz="0" w:space="0" w:color="auto"/>
-          <w:bottom w:val="none" w:sz="0" w:space="0" w:color="auto"/>
-          <w:right w:val="none" w:sz="0" w:space="0" w:color="auto"/>
-          <w:insideH w:val="none" w:sz="0" w:space="0" w:color="auto"/>
-          <w:insideV w:val="none" w:sz="0" w:space="0" w:color="auto"/>
+          <w:top w:val="none" w:color="auto" w:sz="0" w:space="0"/>
+          <w:left w:val="none" w:color="auto" w:sz="0" w:space="0"/>
+          <w:bottom w:val="none" w:color="auto" w:sz="0" w:space="0"/>
+          <w:right w:val="none" w:color="auto" w:sz="0" w:space="0"/>
+          <w:insideH w:val="none" w:color="auto" w:sz="0" w:space="0"/>
+          <w:insideV w:val="none" w:color="auto" w:sz="0" w:space="0"/>
         </w:tblBorders>
         <w:tblLayout w:type="fixed"/>
         <w:tblLook w:val="04A0" w:firstRow="1" w:lastRow="0" w:firstColumn="1" w:lastColumn="0" w:noHBand="0" w:noVBand="1"/>
@@ -642,7 +641,7 @@
                 <w:cnfStyle w:val="001000000000" w:firstRow="0" w:lastRow="0" w:firstColumn="1" w:lastColumn="0" w:oddVBand="0" w:evenVBand="0" w:oddHBand="0" w:evenHBand="0" w:firstRowFirstColumn="0" w:firstRowLastColumn="0" w:lastRowFirstColumn="0" w:lastRowLastColumn="0"/>
                 <w:tcW w:w="4248" w:type="dxa"/>
                 <w:tcBorders>
-                  <w:bottom w:val="none" w:sz="0" w:space="0" w:color="auto"/>
+                  <w:bottom w:val="none" w:color="auto" w:sz="0" w:space="0"/>
                 </w:tcBorders>
               </w:tcPr>
               <w:p>
@@ -672,7 +671,7 @@
               <w:tcPr>
                 <w:tcW w:w="3260" w:type="dxa"/>
                 <w:tcBorders>
-                  <w:bottom w:val="none" w:sz="0" w:space="0" w:color="auto"/>
+                  <w:bottom w:val="none" w:color="auto" w:sz="0" w:space="0"/>
                 </w:tcBorders>
               </w:tcPr>
               <w:p>
@@ -706,7 +705,7 @@
               <w:tcPr>
                 <w:tcW w:w="2120" w:type="dxa"/>
                 <w:tcBorders>
-                  <w:bottom w:val="none" w:sz="0" w:space="0" w:color="auto"/>
+                  <w:bottom w:val="none" w:color="auto" w:sz="0" w:space="0"/>
                 </w:tcBorders>
               </w:tcPr>
               <w:p>
@@ -769,12 +768,6 @@
                     <w15:color w:val="808080"/>
                     <w:text/>
                   </w:sdtPr>
-                  <w:sdtEndPr>
-                    <w:rPr>
-                      <w:b/>
-                      <w:bCs/>
-                    </w:rPr>
-                  </w:sdtEndPr>
                   <w:sdtContent>
                     <w:tc>
                       <w:tcPr>
@@ -865,8 +858,8 @@
     <w:sdt>
       <w:sdtPr>
         <w:alias w:val="PostedEntriesHeaderLbl"/>
-        <w:tag w:val="#BC:InsertDataItem,Labels/PostedEntriesHeaderLbl"/>
-        <w:id w:val="2104759714"/>
+        <w:tag w:val="#BC:InsertDataItem,DataItems/SpendRequest/PostedEntriesHeaderLbl"/>
+        <w:id w:val="1905953375"/>
         <w:placeholder>
           <w:docPart w:val="DefaultPlaceholder_-1854013440"/>
         </w:placeholder>
@@ -891,12 +884,12 @@
         <w:tblStyle w:val="GridTable1Light"/>
         <w:tblW w:w="0" w:type="auto"/>
         <w:tblBorders>
-          <w:top w:val="none" w:sz="0" w:space="0" w:color="auto"/>
-          <w:left w:val="none" w:sz="0" w:space="0" w:color="auto"/>
-          <w:bottom w:val="none" w:sz="0" w:space="0" w:color="auto"/>
-          <w:right w:val="none" w:sz="0" w:space="0" w:color="auto"/>
-          <w:insideH w:val="none" w:sz="0" w:space="0" w:color="auto"/>
-          <w:insideV w:val="none" w:sz="0" w:space="0" w:color="auto"/>
+          <w:top w:val="none" w:color="auto" w:sz="0" w:space="0"/>
+          <w:left w:val="none" w:color="auto" w:sz="0" w:space="0"/>
+          <w:bottom w:val="none" w:color="auto" w:sz="0" w:space="0"/>
+          <w:right w:val="none" w:color="auto" w:sz="0" w:space="0"/>
+          <w:insideH w:val="none" w:color="auto" w:sz="0" w:space="0"/>
+          <w:insideV w:val="none" w:color="auto" w:sz="0" w:space="0"/>
         </w:tblBorders>
         <w:tblLayout w:type="fixed"/>
         <w:tblLook w:val="04A0" w:firstRow="1" w:lastRow="0" w:firstColumn="1" w:lastColumn="0" w:noHBand="0" w:noVBand="1"/>
@@ -928,7 +921,7 @@
                 <w:cnfStyle w:val="001000000000" w:firstRow="0" w:lastRow="0" w:firstColumn="1" w:lastColumn="0" w:oddVBand="0" w:evenVBand="0" w:oddHBand="0" w:evenHBand="0" w:firstRowFirstColumn="0" w:firstRowLastColumn="0" w:lastRowFirstColumn="0" w:lastRowLastColumn="0"/>
                 <w:tcW w:w="2010" w:type="dxa"/>
                 <w:tcBorders>
-                  <w:bottom w:val="none" w:sz="0" w:space="0" w:color="auto"/>
+                  <w:bottom w:val="none" w:color="auto" w:sz="0" w:space="0"/>
                 </w:tcBorders>
               </w:tcPr>
               <w:p>
@@ -957,7 +950,7 @@
               <w:tcPr>
                 <w:tcW w:w="1813" w:type="dxa"/>
                 <w:tcBorders>
-                  <w:bottom w:val="none" w:sz="0" w:space="0" w:color="auto"/>
+                  <w:bottom w:val="none" w:color="auto" w:sz="0" w:space="0"/>
                 </w:tcBorders>
               </w:tcPr>
               <w:p>
@@ -989,7 +982,7 @@
               <w:tcPr>
                 <w:tcW w:w="3555" w:type="dxa"/>
                 <w:tcBorders>
-                  <w:bottom w:val="none" w:sz="0" w:space="0" w:color="auto"/>
+                  <w:bottom w:val="none" w:color="auto" w:sz="0" w:space="0"/>
                 </w:tcBorders>
               </w:tcPr>
               <w:p>
@@ -1021,7 +1014,7 @@
               <w:tcPr>
                 <w:tcW w:w="2250" w:type="dxa"/>
                 <w:tcBorders>
-                  <w:bottom w:val="none" w:sz="0" w:space="0" w:color="auto"/>
+                  <w:bottom w:val="none" w:color="auto" w:sz="0" w:space="0"/>
                 </w:tcBorders>
               </w:tcPr>
               <w:p>
@@ -1070,6 +1063,12 @@
                 <w15:color w:val="808080"/>
                 <w:text/>
               </w:sdtPr>
+              <w:sdtEndPr>
+                <w:rPr>
+                  <w:b/>
+                  <w:bCs/>
+                </w:rPr>
+              </w:sdtEndPr>
               <w:sdtContent>
                 <w:tc>
                   <w:tcPr>
@@ -1376,7 +1375,7 @@
       <w:rPr>
         <w:noProof/>
       </w:rPr>
-      <w:t>2026-08-19</w:t>
+      <w:t>2026-08-20</w:t>
     </w:r>
     <w:r>
       <w:fldChar w:fldCharType="end"/>
@@ -2200,6 +2199,8 @@
     <w:rsid w:val="00A145FE"/>
     <w:rsid w:val="00C12C56"/>
     <w:rsid w:val="00D05AEC"/>
+    <w:rsid w:val="00D16E09"/>
+    <w:rsid w:val="00E42509"/>
     <w:rsid w:val="00F63829"/>
   </w:rsids>
   <m:mathPr>
@@ -3010,7 +3011,9 @@
 </we:webextension>
 </file>
 
-<file path=customXml/item1.xml>��< ? x m l   v e r s i o n = " 1 . 0 "   e n c o d i n g = " u t f - 1 6 " ? > < N a v W o r d R e p o r t X m l P a r t   x m l n s = " u r n : m i c r o s o f t - d y n a m i c s - b u s i n e s s c e n t r a l / i n t e r n a l / e x t e n d e d / r e p o r t s / S p e n d _ R e q u e s t _ D o c u m e n t / 6 8 5 0 / " > +<file path=customXml/item1.xml>��< ? x m l   v e r s i o n = " 1 . 0 "   e n c o d i n g = " u t f - 1 6 " ? > + 
+ < N a v W o r d R e p o r t X m l P a r t   x m l n s = " u r n : m i c r o s o f t - d y n a m i c s - n a v / r e p o r t s / S p e n d _ R e q u e s t _ D o c u m e n t / 6 8 5 0 / " >   
      < B C R e p o r t I n f o r m a t i o n >   
@@ -3156,121 +3159,121 @@
  
      < L a b e l s >   
-         < A p p r o v e d A t C a p t i o n   E l e m e n t T y p e = " P a r a m e t e r "   E l e m e n t I d = " 1 9 3 9 5 6 7 7 8 1 "   D a t a T y p e = " S t r i n g " > A p p r o v e d A t C a p t i o n < / A p p r o v e d A t C a p t i o n > - 
-         < A p p r o v e d B y U s e r N a m e C a p t i o n   E l e m e n t T y p e = " P a r a m e t e r "   E l e m e n t I d = " 1 7 2 2 9 6 4 0 6 1 "   D a t a T y p e = " S t r i n g " > A p p r o v e d B y U s e r N a m e C a p t i o n < / A p p r o v e d B y U s e r N a m e C a p t i o n > - 
-         < C u r r e n c y C o d e C a p t i o n   E l e m e n t T y p e = " P a r a m e t e r "   E l e m e n t I d = " 1 5 7 9 5 9 5 9 2 1 "   D a t a T y p e = " S t r i n g " > C u r r e n c y C o d e C a p t i o n < / C u r r e n c y C o d e C a p t i o n > - 
-         < D e s c r i p t i o n C a p t i o n   E l e m e n t T y p e = " P a r a m e t e r "   E l e m e n t I d = " 1 3 1 4 3 5 1 3 0 7 "   D a t a T y p e = " S t r i n g " > D e s c r i p t i o n C a p t i o n < / D e s c r i p t i o n C a p t i o n > - 
-         < D e t a i l G L A c c o u n t N o C a p t i o n   E l e m e n t T y p e = " P a r a m e t e r "   E l e m e n t I d = " 6 9 2 9 9 7 5 9 3 "   D a t a T y p e = " S t r i n g " > D e t a i l G L A c c o u n t N o C a p t i o n < / D e t a i l G L A c c o u n t N o C a p t i o n > - 
-         < D e t a i l s H e a d e r L b l   E l e m e n t T y p e = " P a r a m e t e r "   E l e m e n t I d = " 1 5 6 2 3 0 7 8 7 8 "   D a t a T y p e = " S t r i n g " > D e t a i l s H e a d e r L b l < / D e t a i l s H e a d e r L b l > - 
-         < E x p e c t e d A m o u n t C a p t i o n   E l e m e n t T y p e = " P a r a m e t e r "   E l e m e n t I d = " 1 3 0 0 9 6 8 5 2 9 "   D a t a T y p e = " S t r i n g " > E x p e c t e d A m o u n t C a p t i o n < / E x p e c t e d A m o u n t C a p t i o n > - 
-         < E x p e c t e d A m o u n t L C Y C a p t i o n   E l e m e n t T y p e = " P a r a m e t e r "   E l e m e n t I d = " 1 6 8 3 8 8 4 3 7 5 "   D a t a T y p e = " S t r i n g " > E x p e c t e d A m o u n t L C Y C a p t i o n < / E x p e c t e d A m o u n t L C Y C a p t i o n > - 
-         < E x p e c t e d E n d D a t e C a p t i o n   E l e m e n t T y p e = " P a r a m e t e r "   E l e m e n t I d = " 7 7 8 2 4 2 0 8 8 "   D a t a T y p e = " S t r i n g " > E x p e c t e d E n d D a t e C a p t i o n < / E x p e c t e d E n d D a t e C a p t i o n > - 
-         < E x p e c t e d S t a r t D a t e C a p t i o n   E l e m e n t T y p e = " P a r a m e t e r "   E l e m e n t I d = " 1 0 1 8 6 6 7 3 7 "   D a t a T y p e = " S t r i n g " > E x p e c t e d S t a r t D a t e C a p t i o n < / E x p e c t e d S t a r t D a t e C a p t i o n > - 
-         < G L A c c o u n t C a p t i o n   E l e m e n t T y p e = " P a r a m e t e r "   E l e m e n t I d = " 1 0 8 2 4 4 8 6 9 7 "   D a t a T y p e = " S t r i n g " > G L A c c o u n t C a p t i o n < / G L A c c o u n t C a p t i o n > - 
-         < G L A c c o u n t N o C a p t i o n   E l e m e n t T y p e = " P a r a m e t e r "   E l e m e n t I d = " 8 8 6 6 5 8 9 3 0 "   D a t a T y p e = " S t r i n g " > G L A c c o u n t N o C a p t i o n < / G L A c c o u n t N o C a p t i o n > - 
-         < L i n e C u r r e n c y C o d e C a p t i o n   E l e m e n t T y p e = " P a r a m e t e r "   E l e m e n t I d = " 1 5 4 8 1 3 3 5 8 3 "   D a t a T y p e = " S t r i n g " > L i n e C u r r e n c y C o d e C a p t i o n < / L i n e C u r r e n c y C o d e C a p t i o n > - 
-         < L i n e N o C a p t i o n   E l e m e n t T y p e = " P a r a m e t e r "   E l e m e n t I d = " 9 8 1 5 1 4 5 2 6 "   D a t a T y p e = " S t r i n g " > L i n e N o C a p t i o n < / L i n e N o C a p t i o n > - 
-         < N o C a p t i o n   E l e m e n t T y p e = " P a r a m e t e r "   E l e m e n t I d = " 1 1 9 8 2 6 8 3 4 0 "   D a t a T y p e = " S t r i n g " > N o C a p t i o n < / N o C a p t i o n > - 
-         < P o s t e d A m o u n t C a p t i o n   E l e m e n t T y p e = " P a r a m e t e r "   E l e m e n t I d = " 9 6 0 3 0 2 3 1 2 "   D a t a T y p e = " S t r i n g " > P o s t e d A m o u n t C a p t i o n < / P o s t e d A m o u n t C a p t i o n > - 
-         < P o s t e d D o c u m e n t N o C a p t i o n   E l e m e n t T y p e = " P a r a m e t e r "   E l e m e n t I d = " 1 3 3 5 5 3 9 9 4 "   D a t a T y p e = " S t r i n g " > P o s t e d D o c u m e n t N o C a p t i o n < / P o s t e d D o c u m e n t N o C a p t i o n > - 
-         < P o s t e d E n t r i e s H e a d e r L b l   E l e m e n t T y p e = " P a r a m e t e r "   E l e m e n t I d = " 2 6 3 4 4 2 8 0 3 "   D a t a T y p e = " S t r i n g " > P o s t e d E n t r i e s H e a d e r L b l < / P o s t e d E n t r i e s H e a d e r L b l > - 
-         < P o s t i n g D a t e C a p t i o n   E l e m e n t T y p e = " P a r a m e t e r "   E l e m e n t I d = " 8 8 9 9 5 5 3 3 7 "   D a t a T y p e = " S t r i n g " > P o s t i n g D a t e C a p t i o n < / P o s t i n g D a t e C a p t i o n > - 
-         < P o s t i n g D e s c r i p t i o n C a p t i o n   E l e m e n t T y p e = " P a r a m e t e r "   E l e m e n t I d = " 6 0 7 8 7 4 6 0 5 "   D a t a T y p e = " S t r i n g " > P o s t i n g D e s c r i p t i o n C a p t i o n < / P o s t i n g D e s c r i p t i o n C a p t i o n > - 
-         < P u r p o s e C a p t i o n   E l e m e n t T y p e = " P a r a m e t e r "   E l e m e n t I d = " 3 1 3 1 5 8 9 0 9 "   D a t a T y p e = " S t r i n g " > P u r p o s e C a p t i o n < / P u r p o s e C a p t i o n > - 
-         < R e p o r t L b l   E l e m e n t T y p e = " P a r a m e t e r "   E l e m e n t I d = " 4 6 0 2 0 4 4 3 1 "   D a t a T y p e = " S t r i n g " > R e p o r t L b l < / R e p o r t L b l > - 
-         < R e q u e s t e d B y C a p t i o n   E l e m e n t T y p e = " P a r a m e t e r "   E l e m e n t I d = " 9 4 6 3 9 1 6 9 8 "   D a t a T y p e = " S t r i n g " > R e q u e s t e d B y C a p t i o n < / R e q u e s t e d B y C a p t i o n > - 
-         < S t a t u s C a p t i o n   E l e m e n t T y p e = " P a r a m e t e r "   E l e m e n t I d = " 1 6 3 4 1 4 4 5 5 1 "   D a t a T y p e = " S t r i n g " > S t a t u s C a p t i o n < / S t a t u s C a p t i o n > - 
-         < T o t a l E x p e c t e d A m o u n t C a p t i o n   E l e m e n t T y p e = " P a r a m e t e r "   E l e m e n t I d = " 1 8 9 2 8 2 9 1 7 3 "   D a t a T y p e = " S t r i n g " > T o t a l E x p e c t e d A m o u n t C a p t i o n < / T o t a l E x p e c t e d A m o u n t C a p t i o n > - 
-         < T o t a l E x p e c t e d A m o u n t L C Y C a p t i o n   E l e m e n t T y p e = " P a r a m e t e r "   E l e m e n t I d = " 1 1 8 4 1 5 6 0 6 7 "   D a t a T y p e = " S t r i n g " > T o t a l E x p e c t e d A m o u n t L C Y C a p t i o n < / T o t a l E x p e c t e d A m o u n t L C Y C a p t i o n > - 
-         < T o t a l S p e n t A m o u n t C a p t i o n   E l e m e n t T y p e = " P a r a m e t e r "   E l e m e n t I d = " 1 3 9 8 8 1 4 0 5 5 "   D a t a T y p e = " S t r i n g " > T o t a l S p e n t A m o u n t C a p t i o n < / T o t a l S p e n t A m o u n t C a p t i o n > +         < A p p r o v e d A t C a p t i o n > A p p r o v e d A t C a p t i o n < / A p p r o v e d A t C a p t i o n > + 
+         < A p p r o v e d B y U s e r N a m e C a p t i o n > A p p r o v e d B y U s e r N a m e C a p t i o n < / A p p r o v e d B y U s e r N a m e C a p t i o n > + 
+         < C u r r e n c y C o d e C a p t i o n > C u r r e n c y C o d e C a p t i o n < / C u r r e n c y C o d e C a p t i o n > + 
+         < D e s c r i p t i o n C a p t i o n > D e s c r i p t i o n C a p t i o n < / D e s c r i p t i o n C a p t i o n > + 
+         < D e t a i l G L A c c o u n t N o C a p t i o n > D e t a i l G L A c c o u n t N o C a p t i o n < / D e t a i l G L A c c o u n t N o C a p t i o n > + 
+         < E x p e c t e d A m o u n t C a p t i o n > E x p e c t e d A m o u n t C a p t i o n < / E x p e c t e d A m o u n t C a p t i o n > + 
+         < E x p e c t e d A m o u n t L C Y C a p t i o n > E x p e c t e d A m o u n t L C Y C a p t i o n < / E x p e c t e d A m o u n t L C Y C a p t i o n > + 
+         < E x p e c t e d E n d D a t e C a p t i o n > E x p e c t e d E n d D a t e C a p t i o n < / E x p e c t e d E n d D a t e C a p t i o n > + 
+         < E x p e c t e d S t a r t D a t e C a p t i o n > E x p e c t e d S t a r t D a t e C a p t i o n < / E x p e c t e d S t a r t D a t e C a p t i o n > + 
+         < G L A c c o u n t C a p t i o n > G L A c c o u n t C a p t i o n < / G L A c c o u n t C a p t i o n > + 
+         < G L A c c o u n t N o C a p t i o n > G L A c c o u n t N o C a p t i o n < / G L A c c o u n t N o C a p t i o n > + 
+         < L i n e C u r r e n c y C o d e C a p t i o n > L i n e C u r r e n c y C o d e C a p t i o n < / L i n e C u r r e n c y C o d e C a p t i o n > + 
+         < L i n e N o C a p t i o n > L i n e N o C a p t i o n < / L i n e N o C a p t i o n > + 
+         < N o C a p t i o n > N o C a p t i o n < / N o C a p t i o n > + 
+         < P o s t e d A m o u n t C a p t i o n > P o s t e d A m o u n t C a p t i o n < / P o s t e d A m o u n t C a p t i o n > + 
+         < P o s t e d D o c u m e n t N o C a p t i o n > P o s t e d D o c u m e n t N o C a p t i o n < / P o s t e d D o c u m e n t N o C a p t i o n > + 
+         < P o s t i n g D a t e C a p t i o n > P o s t i n g D a t e C a p t i o n < / P o s t i n g D a t e C a p t i o n > + 
+         < P o s t i n g D e s c r i p t i o n C a p t i o n > P o s t i n g D e s c r i p t i o n C a p t i o n < / P o s t i n g D e s c r i p t i o n C a p t i o n > + 
+         < P u r p o s e C a p t i o n > P u r p o s e C a p t i o n < / P u r p o s e C a p t i o n > + 
+         < R e q u e s t e d B y C a p t i o n > R e q u e s t e d B y C a p t i o n < / R e q u e s t e d B y C a p t i o n > + 
+         < S t a t u s C a p t i o n > S t a t u s C a p t i o n < / S t a t u s C a p t i o n > + 
+         < T o t a l E x p e c t e d A m o u n t C a p t i o n > T o t a l E x p e c t e d A m o u n t C a p t i o n < / T o t a l E x p e c t e d A m o u n t C a p t i o n > + 
+         < T o t a l E x p e c t e d A m o u n t L C Y C a p t i o n > T o t a l E x p e c t e d A m o u n t L C Y C a p t i o n < / T o t a l E x p e c t e d A m o u n t L C Y C a p t i o n > + 
+         < T o t a l S p e n t A m o u n t C a p t i o n > T o t a l S p e n t A m o u n t C a p t i o n < / T o t a l S p e n t A m o u n t C a p t i o n >   
      < / L a b e l s >   
-     < T o o l t i p s / > - 
-     < S p e n d R e q u e s t   E l e m e n t T y p e = " D a t a I t e m "   E l e m e n t I d = " 1 2 2 6 9 2 1 9 1 2 " > - 
-         < A p p r o v e d A t   E l e m e n t T y p e = " C o l u m n "   E l e m e n t I d = " 1 9 3 9 5 6 7 7 8 1 "   D a t a T y p e = " D a t e T i m e " > A p p r o v e d A t < / A p p r o v e d A t > - 
-         < A p p r o v e d B y U s e r N a m e   E l e m e n t T y p e = " C o l u m n "   E l e m e n t I d = " 1 7 2 2 9 6 4 0 6 1 "   D a t a T y p e = " C o d e " > A p p r o v e d B y U s e r N a m e < / A p p r o v e d B y U s e r N a m e > - 
-         < C u r r e n c y C o d e   E l e m e n t T y p e = " C o l u m n "   E l e m e n t I d = " 1 5 7 9 5 9 5 9 2 1 "   D a t a T y p e = " C o d e " > C u r r e n c y C o d e < / C u r r e n c y C o d e > - 
-         < E m p l o y e e N a m e   E l e m e n t T y p e = " C o l u m n "   E l e m e n t I d = " 1 2 8 6 7 8 4 2 3 2 "   D a t a T y p e = " T e x t " > E m p l o y e e N a m e < / E m p l o y e e N a m e > - 
-         < E x p e c t e d E n d D a t e   E l e m e n t T y p e = " C o l u m n "   E l e m e n t I d = " 7 7 8 2 4 2 0 8 8 "   D a t a T y p e = " D a t e " > E x p e c t e d E n d D a t e < / E x p e c t e d E n d D a t e > - 
-         < E x p e c t e d S t a r t D a t e   E l e m e n t T y p e = " C o l u m n "   E l e m e n t I d = " 1 0 1 8 6 6 7 3 7 "   D a t a T y p e = " D a t e " > E x p e c t e d S t a r t D a t e < / E x p e c t e d S t a r t D a t e > - 
-         < G L A c c o u n t N o   E l e m e n t T y p e = " C o l u m n "   E l e m e n t I d = " 8 8 6 6 5 8 9 3 0 "   D a t a T y p e = " C o d e " > G L A c c o u n t N o < / G L A c c o u n t N o > - 
-         < N o   E l e m e n t T y p e = " C o l u m n "   E l e m e n t I d = " 1 1 9 8 2 6 8 3 4 0 "   D a t a T y p e = " C o d e " > N o < / N o > - 
-         < P u r p o s e   E l e m e n t T y p e = " C o l u m n "   E l e m e n t I d = " 3 1 3 1 5 8 9 0 9 "   D a t a T y p e = " T e x t " > P u r p o s e < / P u r p o s e > - 
-         < R e q u e s t e d B y   E l e m e n t T y p e = " C o l u m n "   E l e m e n t I d = " 9 4 6 3 9 1 6 9 8 "   D a t a T y p e = " C o d e " > R e q u e s t e d B y < / R e q u e s t e d B y > - 
-         < S t a t u s   E l e m e n t T y p e = " C o l u m n "   E l e m e n t I d = " 1 6 3 4 1 4 4 5 5 1 "   D a t a T y p e = " O p t i o n " > S t a t u s < / S t a t u s > - 
-         < T o t a l E x p e c t e d A m o u n t   E l e m e n t T y p e = " C o l u m n "   E l e m e n t I d = " 1 8 9 2 8 2 9 1 7 3 "   D a t a T y p e = " D e c i m a l " > T o t a l E x p e c t e d A m o u n t < / T o t a l E x p e c t e d A m o u n t > - 
-         < T o t a l E x p e c t e d A m o u n t L C Y   E l e m e n t T y p e = " C o l u m n "   E l e m e n t I d = " 1 1 8 4 1 5 6 0 6 7 "   D a t a T y p e = " D e c i m a l " > T o t a l E x p e c t e d A m o u n t L C Y < / T o t a l E x p e c t e d A m o u n t L C Y > - 
-         < T o t a l S p e n t A m o u n t   E l e m e n t T y p e = " C o l u m n "   E l e m e n t I d = " 1 3 9 8 8 1 4 0 5 5 "   D a t a T y p e = " D e c i m a l " > T o t a l S p e n t A m o u n t < / T o t a l S p e n t A m o u n t > - 
-         < S p e n d R e q u e s t D e t a i l   E l e m e n t T y p e = " D a t a I t e m "   E l e m e n t I d = " 1 0 7 7 5 5 8 4 7 " > - 
-             < D e s c r i p t i o n   E l e m e n t T y p e = " C o l u m n "   E l e m e n t I d = " 1 3 1 4 3 5 1 3 0 7 "   D a t a T y p e = " T e x t " > D e s c r i p t i o n < / D e s c r i p t i o n > - 
-             < D e t a i l G L A c c o u n t N o   E l e m e n t T y p e = " C o l u m n "   E l e m e n t I d = " 6 9 2 9 9 7 5 9 3 "   D a t a T y p e = " C o d e " > D e t a i l G L A c c o u n t N o < / D e t a i l G L A c c o u n t N o > - 
-             < E x p e c t e d A m o u n t   E l e m e n t T y p e = " C o l u m n "   E l e m e n t I d = " 1 3 0 0 9 6 8 5 2 9 "   D a t a T y p e = " D e c i m a l " > E x p e c t e d A m o u n t < / E x p e c t e d A m o u n t > - 
-             < E x p e c t e d A m o u n t L C Y   E l e m e n t T y p e = " C o l u m n "   E l e m e n t I d = " 1 6 8 3 8 8 4 3 7 5 "   D a t a T y p e = " D e c i m a l " > E x p e c t e d A m o u n t L C Y < / E x p e c t e d A m o u n t L C Y > - 
-             < L i n e C u r r e n c y C o d e   E l e m e n t T y p e = " C o l u m n "   E l e m e n t I d = " 1 5 4 8 1 3 3 5 8 3 "   D a t a T y p e = " C o d e " > L i n e C u r r e n c y C o d e < / L i n e C u r r e n c y C o d e > - 
-             < L i n e N o   E l e m e n t T y p e = " C o l u m n "   E l e m e n t I d = " 9 8 1 5 1 4 5 2 6 "   D a t a T y p e = " I n t e g e r " > L i n e N o < / L i n e N o > +     < S p e n d R e q u e s t > + 
+         < A p p r o v e d A t > A p p r o v e d A t < / A p p r o v e d A t > + 
+         < A p p r o v e d B y U s e r N a m e > A p p r o v e d B y U s e r N a m e < / A p p r o v e d B y U s e r N a m e > + 
+         < C u r r e n c y C o d e > C u r r e n c y C o d e < / C u r r e n c y C o d e > + 
+         < D e t a i l s H e a d e r L b l > D e t a i l s H e a d e r L b l < / D e t a i l s H e a d e r L b l > + 
+         < E m p l o y e e F u l l N a m e L b l > E m p l o y e e F u l l N a m e L b l < / E m p l o y e e F u l l N a m e L b l > + 
+         < E m p l o y e e N a m e > E m p l o y e e N a m e < / E m p l o y e e N a m e > + 
+         < E x p e c t e d E n d D a t e > E x p e c t e d E n d D a t e < / E x p e c t e d E n d D a t e > + 
+         < E x p e c t e d S t a r t D a t e > E x p e c t e d S t a r t D a t e < / E x p e c t e d S t a r t D a t e > + 
+         < G L A c c o u n t N o > G L A c c o u n t N o < / G L A c c o u n t N o > + 
+         < N o > N o < / N o > + 
+         < P o s t e d E n t r i e s H e a d e r L b l > P o s t e d E n t r i e s H e a d e r L b l < / P o s t e d E n t r i e s H e a d e r L b l > + 
+         < P u r p o s e > P u r p o s e < / P u r p o s e > + 
+         < R e p o r t L b l > R e p o r t L b l < / R e p o r t L b l > + 
+         < R e q u e s t e d B y > R e q u e s t e d B y < / R e q u e s t e d B y > + 
+         < S t a t u s > S t a t u s < / S t a t u s > + 
+         < T o t a l E x p e c t e d A m o u n t > T o t a l E x p e c t e d A m o u n t < / T o t a l E x p e c t e d A m o u n t > + 
+         < T o t a l E x p e c t e d A m o u n t L C Y > T o t a l E x p e c t e d A m o u n t L C Y < / T o t a l E x p e c t e d A m o u n t L C Y > + 
+         < T o t a l S p e n t A m o u n t > T o t a l S p e n t A m o u n t < / T o t a l S p e n t A m o u n t > + 
+         < S p e n d R e q u e s t D e t a i l > + 
+             < D e s c r i p t i o n > D e s c r i p t i o n < / D e s c r i p t i o n > + 
+             < D e t a i l G L A c c o u n t N o > D e t a i l G L A c c o u n t N o < / D e t a i l G L A c c o u n t N o > + 
+             < E x p e c t e d A m o u n t > E x p e c t e d A m o u n t < / E x p e c t e d A m o u n t > + 
+             < E x p e c t e d A m o u n t L C Y > E x p e c t e d A m o u n t L C Y < / E x p e c t e d A m o u n t L C Y > + 
+             < L i n e C u r r e n c y C o d e > L i n e C u r r e n c y C o d e < / L i n e C u r r e n c y C o d e > + 
+             < L i n e N o > L i n e N o < / L i n e N o >   
          < / S p e n d R e q u e s t D e t a i l >   
-         < S p e n d R e q u e s t G L E n t r i e s   E l e m e n t T y p e = " D a t a I t e m "   E l e m e n t I d = " 9 3 4 1 0 6 3 8 5 " > - 
-             < G L A c c o u n t   E l e m e n t T y p e = " C o l u m n "   E l e m e n t I d = " 1 0 8 2 4 4 8 6 9 7 "   D a t a T y p e = " C o d e " > G L A c c o u n t < / G L A c c o u n t > - 
-             < P o s t e d A m o u n t   E l e m e n t T y p e = " C o l u m n "   E l e m e n t I d = " 9 6 0 3 0 2 3 1 2 "   D a t a T y p e = " D e c i m a l " > P o s t e d A m o u n t < / P o s t e d A m o u n t > - 
-             < P o s t e d D o c u m e n t N o   E l e m e n t T y p e = " C o l u m n "   E l e m e n t I d = " 1 3 3 5 5 3 9 9 4 "   D a t a T y p e = " C o d e " > P o s t e d D o c u m e n t N o < / P o s t e d D o c u m e n t N o > - 
-             < P o s t i n g D a t e   E l e m e n t T y p e = " C o l u m n "   E l e m e n t I d = " 8 8 9 9 5 5 3 3 7 "   D a t a T y p e = " D a t e " > P o s t i n g D a t e < / P o s t i n g D a t e > - 
-             < P o s t i n g D e s c r i p t i o n   E l e m e n t T y p e = " C o l u m n "   E l e m e n t I d = " 6 0 7 8 7 4 6 0 5 "   D a t a T y p e = " T e x t " > P o s t i n g D e s c r i p t i o n < / P o s t i n g D e s c r i p t i o n > +         < S p e n d R e q u e s t G L E n t r i e s > + 
+             < G L A c c o u n t > G L A c c o u n t < / G L A c c o u n t > + 
+             < P o s t e d A m o u n t > P o s t e d A m o u n t < / P o s t e d A m o u n t > + 
+             < P o s t e d D o c u m e n t N o > P o s t e d D o c u m e n t N o < / P o s t e d D o c u m e n t N o > + 
+             < P o s t i n g D a t e > P o s t i n g D a t e < / P o s t i n g D a t e > + 
+             < P o s t i n g D e s c r i p t i o n > P o s t i n g D e s c r i p t i o n < / P o s t i n g D e s c r i p t i o n >   
          < / S p e n d R e q u e s t G L E n t r i e s >   
@@ -3279,7 +3282,9 @@
  < / N a v W o r d R e p o r t X m l P a r t > 
 </file>
 
-<file path=customXml/item2.xml>��< ? x m l   v e r s i o n = " 1 . 0 "   e n c o d i n g = " u t f - 1 6 " ? > < N a v W o r d R e p o r t X m l P a r t   x m l n s = " u r n : m i c r o s o f t - d y n a m i c s - n a v / r e p o r t s / S p e n d _ R e q u e s t _ D o c u m e n t / 6 8 5 0 / " > +<file path=customXml/item2.xml>��< ? x m l   v e r s i o n = " 1 . 0 "   e n c o d i n g = " u t f - 1 6 " ? > + 
+ < N a v W o r d R e p o r t X m l P a r t   x m l n s = " u r n : m i c r o s o f t - d y n a m i c s - b u s i n e s s c e n t r a l / i n t e r n a l / e x t e n d e d / r e p o r t s / S p e n d _ R e q u e s t _ D o c u m e n t / 6 8 5 0 / " >   
      < B C R e p o r t I n f o r m a t i o n >   
@@ -3425,119 +3430,123 @@
  
      < L a b e l s >   
-         < A p p r o v e d A t C a p t i o n > A p p r o v e d A t C a p t i o n < / A p p r o v e d A t C a p t i o n > - 
-         < A p p r o v e d B y U s e r N a m e C a p t i o n > A p p r o v e d B y U s e r N a m e C a p t i o n < / A p p r o v e d B y U s e r N a m e C a p t i o n > - 
-         < C u r r e n c y C o d e C a p t i o n > C u r r e n c y C o d e C a p t i o n < / C u r r e n c y C o d e C a p t i o n > - 
-         < D e s c r i p t i o n C a p t i o n > D e s c r i p t i o n C a p t i o n < / D e s c r i p t i o n C a p t i o n > - 
-         < D e t a i l G L A c c o u n t N o C a p t i o n > D e t a i l G L A c c o u n t N o C a p t i o n < / D e t a i l G L A c c o u n t N o C a p t i o n > - 
-         < D e t a i l s H e a d e r L b l > D e t a i l s H e a d e r L b l < / D e t a i l s H e a d e r L b l > - 
-         < E x p e c t e d A m o u n t C a p t i o n > E x p e c t e d A m o u n t C a p t i o n < / E x p e c t e d A m o u n t C a p t i o n > - 
-         < E x p e c t e d A m o u n t L C Y C a p t i o n > E x p e c t e d A m o u n t L C Y C a p t i o n < / E x p e c t e d A m o u n t L C Y C a p t i o n > - 
-         < E x p e c t e d E n d D a t e C a p t i o n > E x p e c t e d E n d D a t e C a p t i o n < / E x p e c t e d E n d D a t e C a p t i o n > - 
-         < E x p e c t e d S t a r t D a t e C a p t i o n > E x p e c t e d S t a r t D a t e C a p t i o n < / E x p e c t e d S t a r t D a t e C a p t i o n > - 
-         < G L A c c o u n t C a p t i o n > G L A c c o u n t C a p t i o n < / G L A c c o u n t C a p t i o n > - 
-         < G L A c c o u n t N o C a p t i o n > G L A c c o u n t N o C a p t i o n < / G L A c c o u n t N o C a p t i o n > - 
-         < L i n e C u r r e n c y C o d e C a p t i o n > L i n e C u r r e n c y C o d e C a p t i o n < / L i n e C u r r e n c y C o d e C a p t i o n > - 
-         < L i n e N o C a p t i o n > L i n e N o C a p t i o n < / L i n e N o C a p t i o n > - 
-         < N o C a p t i o n > N o C a p t i o n < / N o C a p t i o n > - 
-         < P o s t e d A m o u n t C a p t i o n > P o s t e d A m o u n t C a p t i o n < / P o s t e d A m o u n t C a p t i o n > - 
-         < P o s t e d D o c u m e n t N o C a p t i o n > P o s t e d D o c u m e n t N o C a p t i o n < / P o s t e d D o c u m e n t N o C a p t i o n > - 
-         < P o s t e d E n t r i e s H e a d e r L b l > P o s t e d E n t r i e s H e a d e r L b l < / P o s t e d E n t r i e s H e a d e r L b l > - 
-         < P o s t i n g D a t e C a p t i o n > P o s t i n g D a t e C a p t i o n < / P o s t i n g D a t e C a p t i o n > - 
-         < P o s t i n g D e s c r i p t i o n C a p t i o n > P o s t i n g D e s c r i p t i o n C a p t i o n < / P o s t i n g D e s c r i p t i o n C a p t i o n > - 
-         < P u r p o s e C a p t i o n > P u r p o s e C a p t i o n < / P u r p o s e C a p t i o n > - 
-         < R e p o r t L b l > R e p o r t L b l < / R e p o r t L b l > - 
-         < R e q u e s t e d B y C a p t i o n > R e q u e s t e d B y C a p t i o n < / R e q u e s t e d B y C a p t i o n > - 
-         < S t a t u s C a p t i o n > S t a t u s C a p t i o n < / S t a t u s C a p t i o n > - 
-         < T o t a l E x p e c t e d A m o u n t C a p t i o n > T o t a l E x p e c t e d A m o u n t C a p t i o n < / T o t a l E x p e c t e d A m o u n t C a p t i o n > - 
-         < T o t a l E x p e c t e d A m o u n t L C Y C a p t i o n > T o t a l E x p e c t e d A m o u n t L C Y C a p t i o n < / T o t a l E x p e c t e d A m o u n t L C Y C a p t i o n > - 
-         < T o t a l S p e n t A m o u n t C a p t i o n > T o t a l S p e n t A m o u n t C a p t i o n < / T o t a l S p e n t A m o u n t C a p t i o n > +         < A p p r o v e d A t C a p t i o n   E l e m e n t T y p e = " P a r a m e t e r "   E l e m e n t I d = " 1 9 3 9 5 6 7 7 8 1 "   D a t a T y p e = " S t r i n g " > A p p r o v e d A t C a p t i o n < / A p p r o v e d A t C a p t i o n > + 
+         < A p p r o v e d B y U s e r N a m e C a p t i o n   E l e m e n t T y p e = " P a r a m e t e r "   E l e m e n t I d = " 1 7 2 2 9 6 4 0 6 1 "   D a t a T y p e = " S t r i n g " > A p p r o v e d B y U s e r N a m e C a p t i o n < / A p p r o v e d B y U s e r N a m e C a p t i o n > + 
+         < C u r r e n c y C o d e C a p t i o n   E l e m e n t T y p e = " P a r a m e t e r "   E l e m e n t I d = " 1 5 7 9 5 9 5 9 2 1 "   D a t a T y p e = " S t r i n g " > C u r r e n c y C o d e C a p t i o n < / C u r r e n c y C o d e C a p t i o n > + 
+         < D e s c r i p t i o n C a p t i o n   E l e m e n t T y p e = " P a r a m e t e r "   E l e m e n t I d = " 1 3 1 4 3 5 1 3 0 7 "   D a t a T y p e = " S t r i n g " > D e s c r i p t i o n C a p t i o n < / D e s c r i p t i o n C a p t i o n > + 
+         < D e t a i l G L A c c o u n t N o C a p t i o n   E l e m e n t T y p e = " P a r a m e t e r "   E l e m e n t I d = " 6 9 2 9 9 7 5 9 3 "   D a t a T y p e = " S t r i n g " > D e t a i l G L A c c o u n t N o C a p t i o n < / D e t a i l G L A c c o u n t N o C a p t i o n > + 
+         < E x p e c t e d A m o u n t C a p t i o n   E l e m e n t T y p e = " P a r a m e t e r "   E l e m e n t I d = " 1 3 0 0 9 6 8 5 2 9 "   D a t a T y p e = " S t r i n g " > E x p e c t e d A m o u n t C a p t i o n < / E x p e c t e d A m o u n t C a p t i o n > + 
+         < E x p e c t e d A m o u n t L C Y C a p t i o n   E l e m e n t T y p e = " P a r a m e t e r "   E l e m e n t I d = " 1 6 8 3 8 8 4 3 7 5 "   D a t a T y p e = " S t r i n g " > E x p e c t e d A m o u n t L C Y C a p t i o n < / E x p e c t e d A m o u n t L C Y C a p t i o n > + 
+         < E x p e c t e d E n d D a t e C a p t i o n   E l e m e n t T y p e = " P a r a m e t e r "   E l e m e n t I d = " 7 7 8 2 4 2 0 8 8 "   D a t a T y p e = " S t r i n g " > E x p e c t e d E n d D a t e C a p t i o n < / E x p e c t e d E n d D a t e C a p t i o n > + 
+         < E x p e c t e d S t a r t D a t e C a p t i o n   E l e m e n t T y p e = " P a r a m e t e r "   E l e m e n t I d = " 1 0 1 8 6 6 7 3 7 "   D a t a T y p e = " S t r i n g " > E x p e c t e d S t a r t D a t e C a p t i o n < / E x p e c t e d S t a r t D a t e C a p t i o n > + 
+         < G L A c c o u n t C a p t i o n   E l e m e n t T y p e = " P a r a m e t e r "   E l e m e n t I d = " 1 0 8 2 4 4 8 6 9 7 "   D a t a T y p e = " S t r i n g " > G L A c c o u n t C a p t i o n < / G L A c c o u n t C a p t i o n > + 
+         < G L A c c o u n t N o C a p t i o n   E l e m e n t T y p e = " P a r a m e t e r "   E l e m e n t I d = " 8 8 6 6 5 8 9 3 0 "   D a t a T y p e = " S t r i n g " > G L A c c o u n t N o C a p t i o n < / G L A c c o u n t N o C a p t i o n > + 
+         < L i n e C u r r e n c y C o d e C a p t i o n   E l e m e n t T y p e = " P a r a m e t e r "   E l e m e n t I d = " 1 5 4 8 1 3 3 5 8 3 "   D a t a T y p e = " S t r i n g " > L i n e C u r r e n c y C o d e C a p t i o n < / L i n e C u r r e n c y C o d e C a p t i o n > + 
+         < L i n e N o C a p t i o n   E l e m e n t T y p e = " P a r a m e t e r "   E l e m e n t I d = " 9 8 1 5 1 4 5 2 6 "   D a t a T y p e = " S t r i n g " > L i n e N o C a p t i o n < / L i n e N o C a p t i o n > + 
+         < N o C a p t i o n   E l e m e n t T y p e = " P a r a m e t e r "   E l e m e n t I d = " 1 1 9 8 2 6 8 3 4 0 "   D a t a T y p e = " S t r i n g " > N o C a p t i o n < / N o C a p t i o n > + 
+         < P o s t e d A m o u n t C a p t i o n   E l e m e n t T y p e = " P a r a m e t e r "   E l e m e n t I d = " 9 6 0 3 0 2 3 1 2 "   D a t a T y p e = " S t r i n g " > P o s t e d A m o u n t C a p t i o n < / P o s t e d A m o u n t C a p t i o n > + 
+         < P o s t e d D o c u m e n t N o C a p t i o n   E l e m e n t T y p e = " P a r a m e t e r "   E l e m e n t I d = " 1 3 3 5 5 3 9 9 4 "   D a t a T y p e = " S t r i n g " > P o s t e d D o c u m e n t N o C a p t i o n < / P o s t e d D o c u m e n t N o C a p t i o n > + 
+         < P o s t i n g D a t e C a p t i o n   E l e m e n t T y p e = " P a r a m e t e r "   E l e m e n t I d = " 8 8 9 9 5 5 3 3 7 "   D a t a T y p e = " S t r i n g " > P o s t i n g D a t e C a p t i o n < / P o s t i n g D a t e C a p t i o n > + 
+         < P o s t i n g D e s c r i p t i o n C a p t i o n   E l e m e n t T y p e = " P a r a m e t e r "   E l e m e n t I d = " 6 0 7 8 7 4 6 0 5 "   D a t a T y p e = " S t r i n g " > P o s t i n g D e s c r i p t i o n C a p t i o n < / P o s t i n g D e s c r i p t i o n C a p t i o n > + 
+         < P u r p o s e C a p t i o n   E l e m e n t T y p e = " P a r a m e t e r "   E l e m e n t I d = " 3 1 3 1 5 8 9 0 9 "   D a t a T y p e = " S t r i n g " > P u r p o s e C a p t i o n < / P u r p o s e C a p t i o n > + 
+         < R e q u e s t e d B y C a p t i o n   E l e m e n t T y p e = " P a r a m e t e r "   E l e m e n t I d = " 9 4 6 3 9 1 6 9 8 "   D a t a T y p e = " S t r i n g " > R e q u e s t e d B y C a p t i o n < / R e q u e s t e d B y C a p t i o n > + 
+         < S t a t u s C a p t i o n   E l e m e n t T y p e = " P a r a m e t e r "   E l e m e n t I d = " 1 6 3 4 1 4 4 5 5 1 "   D a t a T y p e = " S t r i n g " > S t a t u s C a p t i o n < / S t a t u s C a p t i o n > + 
+         < T o t a l E x p e c t e d A m o u n t C a p t i o n   E l e m e n t T y p e = " P a r a m e t e r "   E l e m e n t I d = " 1 8 9 2 8 2 9 1 7 3 "   D a t a T y p e = " S t r i n g " > T o t a l E x p e c t e d A m o u n t C a p t i o n < / T o t a l E x p e c t e d A m o u n t C a p t i o n > + 
+         < T o t a l E x p e c t e d A m o u n t L C Y C a p t i o n   E l e m e n t T y p e = " P a r a m e t e r "   E l e m e n t I d = " 1 1 8 4 1 5 6 0 6 7 "   D a t a T y p e = " S t r i n g " > T o t a l E x p e c t e d A m o u n t L C Y C a p t i o n < / T o t a l E x p e c t e d A m o u n t L C Y C a p t i o n > + 
+         < T o t a l S p e n t A m o u n t C a p t i o n   E l e m e n t T y p e = " P a r a m e t e r "   E l e m e n t I d = " 1 3 9 8 8 1 4 0 5 5 "   D a t a T y p e = " S t r i n g " > T o t a l S p e n t A m o u n t C a p t i o n < / T o t a l S p e n t A m o u n t C a p t i o n >   
      < / L a b e l s >   
-     < S p e n d R e q u e s t > - 
-         < A p p r o v e d A t > A p p r o v e d A t < / A p p r o v e d A t > - 
-         < A p p r o v e d B y U s e r N a m e > A p p r o v e d B y U s e r N a m e < / A p p r o v e d B y U s e r N a m e > - 
-         < C u r r e n c y C o d e > C u r r e n c y C o d e < / C u r r e n c y C o d e > - 
-         < E m p l o y e e N a m e > E m p l o y e e N a m e < / E m p l o y e e N a m e > - 
-         < E x p e c t e d E n d D a t e > E x p e c t e d E n d D a t e < / E x p e c t e d E n d D a t e > - 
-         < E x p e c t e d S t a r t D a t e > E x p e c t e d S t a r t D a t e < / E x p e c t e d S t a r t D a t e > - 
-         < G L A c c o u n t N o > G L A c c o u n t N o < / G L A c c o u n t N o > - 
-         < N o > N o < / N o > - 
-         < P u r p o s e > P u r p o s e < / P u r p o s e > - 
-         < R e q u e s t e d B y > R e q u e s t e d B y < / R e q u e s t e d B y > - 
-         < S t a t u s > S t a t u s < / S t a t u s > - 
-         < T o t a l E x p e c t e d A m o u n t > T o t a l E x p e c t e d A m o u n t < / T o t a l E x p e c t e d A m o u n t > - 
-         < T o t a l E x p e c t e d A m o u n t L C Y > T o t a l E x p e c t e d A m o u n t L C Y < / T o t a l E x p e c t e d A m o u n t L C Y > - 
-         < T o t a l S p e n t A m o u n t > T o t a l S p e n t A m o u n t < / T o t a l S p e n t A m o u n t > - 
-         < S p e n d R e q u e s t D e t a i l > - 
-             < D e s c r i p t i o n > D e s c r i p t i o n < / D e s c r i p t i o n > - 
-             < D e t a i l G L A c c o u n t N o > D e t a i l G L A c c o u n t N o < / D e t a i l G L A c c o u n t N o > - 
-             < E x p e c t e d A m o u n t > E x p e c t e d A m o u n t < / E x p e c t e d A m o u n t > - 
-             < E x p e c t e d A m o u n t L C Y > E x p e c t e d A m o u n t L C Y < / E x p e c t e d A m o u n t L C Y > - 
-             < L i n e C u r r e n c y C o d e > L i n e C u r r e n c y C o d e < / L i n e C u r r e n c y C o d e > - 
-             < L i n e N o > L i n e N o < / L i n e N o > +     < T o o l t i p s   / > + 
+     < S p e n d R e q u e s t   E l e m e n t T y p e = " D a t a I t e m "   E l e m e n t I d = " 1 2 2 6 9 2 1 9 1 2 " > + 
+         < A p p r o v e d A t   E l e m e n t T y p e = " C o l u m n "   E l e m e n t I d = " 1 9 3 9 5 6 7 7 8 1 "   D a t a T y p e = " D a t e T i m e " > A p p r o v e d A t < / A p p r o v e d A t > + 
+         < A p p r o v e d B y U s e r N a m e   E l e m e n t T y p e = " C o l u m n "   E l e m e n t I d = " 1 7 2 2 9 6 4 0 6 1 "   D a t a T y p e = " C o d e " > A p p r o v e d B y U s e r N a m e < / A p p r o v e d B y U s e r N a m e > + 
+         < C u r r e n c y C o d e   E l e m e n t T y p e = " C o l u m n "   E l e m e n t I d = " 1 5 7 9 5 9 5 9 2 1 "   D a t a T y p e = " C o d e " > C u r r e n c y C o d e < / C u r r e n c y C o d e > + 
+         < D e t a i l s H e a d e r L b l   E l e m e n t T y p e = " C o l u m n "   E l e m e n t I d = " 1 5 6 2 3 0 7 8 7 8 "   D a t a T y p e = " T e x t C o n s t " > D e t a i l s H e a d e r L b l < / D e t a i l s H e a d e r L b l > + 
+         < E m p l o y e e F u l l N a m e L b l   E l e m e n t T y p e = " C o l u m n "   E l e m e n t I d = " 1 5 5 9 4 3 9 2 2 3 "   D a t a T y p e = " T e x t C o n s t " > E m p l o y e e F u l l N a m e L b l < / E m p l o y e e F u l l N a m e L b l > + 
+         < E m p l o y e e N a m e   E l e m e n t T y p e = " C o l u m n "   E l e m e n t I d = " 1 2 8 6 7 8 4 2 3 2 "   D a t a T y p e = " T e x t " > E m p l o y e e N a m e < / E m p l o y e e N a m e > + 
+         < E x p e c t e d E n d D a t e   E l e m e n t T y p e = " C o l u m n "   E l e m e n t I d = " 7 7 8 2 4 2 0 8 8 "   D a t a T y p e = " D a t e " > E x p e c t e d E n d D a t e < / E x p e c t e d E n d D a t e > + 
+         < E x p e c t e d S t a r t D a t e   E l e m e n t T y p e = " C o l u m n "   E l e m e n t I d = " 1 0 1 8 6 6 7 3 7 "   D a t a T y p e = " D a t e " > E x p e c t e d S t a r t D a t e < / E x p e c t e d S t a r t D a t e > + 
+         < G L A c c o u n t N o   E l e m e n t T y p e = " C o l u m n "   E l e m e n t I d = " 8 8 6 6 5 8 9 3 0 "   D a t a T y p e = " C o d e " > G L A c c o u n t N o < / G L A c c o u n t N o > + 
+         < N o   E l e m e n t T y p e = " C o l u m n "   E l e m e n t I d = " 1 1 9 8 2 6 8 3 4 0 "   D a t a T y p e = " C o d e " > N o < / N o > + 
+         < P o s t e d E n t r i e s H e a d e r L b l   E l e m e n t T y p e = " C o l u m n "   E l e m e n t I d = " 2 6 3 4 4 2 8 0 3 "   D a t a T y p e = " T e x t C o n s t " > P o s t e d E n t r i e s H e a d e r L b l < / P o s t e d E n t r i e s H e a d e r L b l > + 
+         < P u r p o s e   E l e m e n t T y p e = " C o l u m n "   E l e m e n t I d = " 3 1 3 1 5 8 9 0 9 "   D a t a T y p e = " T e x t " > P u r p o s e < / P u r p o s e > + 
+         < R e p o r t L b l   E l e m e n t T y p e = " C o l u m n "   E l e m e n t I d = " 4 6 0 2 0 4 4 3 1 "   D a t a T y p e = " T e x t C o n s t " > R e p o r t L b l < / R e p o r t L b l > + 
+         < R e q u e s t e d B y   E l e m e n t T y p e = " C o l u m n "   E l e m e n t I d = " 9 4 6 3 9 1 6 9 8 "   D a t a T y p e = " C o d e " > R e q u e s t e d B y < / R e q u e s t e d B y > + 
+         < S t a t u s   E l e m e n t T y p e = " C o l u m n "   E l e m e n t I d = " 1 6 3 4 1 4 4 5 5 1 "   D a t a T y p e = " O p t i o n " > S t a t u s < / S t a t u s > + 
+         < T o t a l E x p e c t e d A m o u n t   E l e m e n t T y p e = " C o l u m n "   E l e m e n t I d = " 1 8 9 2 8 2 9 1 7 3 "   D a t a T y p e = " D e c i m a l " > T o t a l E x p e c t e d A m o u n t < / T o t a l E x p e c t e d A m o u n t > + 
+         < T o t a l E x p e c t e d A m o u n t L C Y   E l e m e n t T y p e = " C o l u m n "   E l e m e n t I d = " 1 1 8 4 1 5 6 0 6 7 "   D a t a T y p e = " D e c i m a l " > T o t a l E x p e c t e d A m o u n t L C Y < / T o t a l E x p e c t e d A m o u n t L C Y > + 
+         < T o t a l S p e n t A m o u n t   E l e m e n t T y p e = " C o l u m n "   E l e m e n t I d = " 1 3 9 8 8 1 4 0 5 5 "   D a t a T y p e = " D e c i m a l " > T o t a l S p e n t A m o u n t < / T o t a l S p e n t A m o u n t > + 
+         < S p e n d R e q u e s t D e t a i l   E l e m e n t T y p e = " D a t a I t e m "   E l e m e n t I d = " 1 0 7 7 5 5 8 4 7 " > + 
+             < D e s c r i p t i o n   E l e m e n t T y p e = " C o l u m n "   E l e m e n t I d = " 1 3 1 4 3 5 1 3 0 7 "   D a t a T y p e = " T e x t " > D e s c r i p t i o n < / D e s c r i p t i o n > + 
+             < D e t a i l G L A c c o u n t N o   E l e m e n t T y p e = " C o l u m n "   E l e m e n t I d = " 6 9 2 9 9 7 5 9 3 "   D a t a T y p e = " C o d e " > D e t a i l G L A c c o u n t N o < / D e t a i l G L A c c o u n t N o > + 
+             < E x p e c t e d A m o u n t   E l e m e n t T y p e = " C o l u m n "   E l e m e n t I d = " 1 3 0 0 9 6 8 5 2 9 "   D a t a T y p e = " D e c i m a l " > E x p e c t e d A m o u n t < / E x p e c t e d A m o u n t > + 
+             < E x p e c t e d A m o u n t L C Y   E l e m e n t T y p e = " C o l u m n "   E l e m e n t I d = " 1 6 8 3 8 8 4 3 7 5 "   D a t a T y p e = " D e c i m a l " > E x p e c t e d A m o u n t L C Y < / E x p e c t e d A m o u n t L C Y > + 
+             < L i n e C u r r e n c y C o d e   E l e m e n t T y p e = " C o l u m n "   E l e m e n t I d = " 1 5 4 8 1 3 3 5 8 3 "   D a t a T y p e = " C o d e " > L i n e C u r r e n c y C o d e < / L i n e C u r r e n c y C o d e > + 
+             < L i n e N o   E l e m e n t T y p e = " C o l u m n "   E l e m e n t I d = " 9 8 1 5 1 4 5 2 6 "   D a t a T y p e = " I n t e g e r " > L i n e N o < / L i n e N o >   
          < / S p e n d R e q u e s t D e t a i l >   
-         < S p e n d R e q u e s t G L E n t r i e s > - 
-             < G L A c c o u n t > G L A c c o u n t < / G L A c c o u n t > - 
-             < P o s t e d A m o u n t > P o s t e d A m o u n t < / P o s t e d A m o u n t > - 
-             < P o s t e d D o c u m e n t N o > P o s t e d D o c u m e n t N o < / P o s t e d D o c u m e n t N o > - 
-             < P o s t i n g D a t e > P o s t i n g D a t e < / P o s t i n g D a t e > - 
-             < P o s t i n g D e s c r i p t i o n > P o s t i n g D e s c r i p t i o n < / P o s t i n g D e s c r i p t i o n > +         < S p e n d R e q u e s t G L E n t r i e s   E l e m e n t T y p e = " D a t a I t e m "   E l e m e n t I d = " 9 3 4 1 0 6 3 8 5 " > + 
+             < G L A c c o u n t   E l e m e n t T y p e = " C o l u m n "   E l e m e n t I d = " 1 0 8 2 4 4 8 6 9 7 "   D a t a T y p e = " C o d e " > G L A c c o u n t < / G L A c c o u n t > + 
+             < P o s t e d A m o u n t   E l e m e n t T y p e = " C o l u m n "   E l e m e n t I d = " 9 6 0 3 0 2 3 1 2 "   D a t a T y p e = " D e c i m a l " > P o s t e d A m o u n t < / P o s t e d A m o u n t > + 
+             < P o s t e d D o c u m e n t N o   E l e m e n t T y p e = " C o l u m n "   E l e m e n t I d = " 1 3 3 5 5 3 9 9 4 "   D a t a T y p e = " C o d e " > P o s t e d D o c u m e n t N o < / P o s t e d D o c u m e n t N o > + 
+             < P o s t i n g D a t e   E l e m e n t T y p e = " C o l u m n "   E l e m e n t I d = " 8 8 9 9 5 5 3 3 7 "   D a t a T y p e = " D a t e " > P o s t i n g D a t e < / P o s t i n g D a t e > + 
+             < P o s t i n g D e s c r i p t i o n   E l e m e n t T y p e = " C o l u m n "   E l e m e n t I d = " 6 0 7 8 7 4 6 0 5 "   D a t a T y p e = " T e x t " > P o s t i n g D e s c r i p t i o n < / P o s t i n g D e s c r i p t i o n >   
          < / S p e n d R e q u e s t G L E n t r i e s >   
@@ -3547,17 +3556,17 @@
 </file>
 
 <file path=customXml/itemProps1.xml><?xml version="1.0" encoding="utf-8"?>
-<ds:datastoreItem xmlns:ds="http://schemas.openxmlformats.org/officeDocument/2006/customXml" ds:itemID="{0FA14807-1C08-4DEE-962E-4F4BB28529B6}">
+<ds:datastoreItem xmlns:ds="http://schemas.openxmlformats.org/officeDocument/2006/customXml" ds:itemID="{7828BD88-85FA-4D15-824F-B6C2963E083B}">
   <ds:schemaRefs>
-    <ds:schemaRef ds:uri="urn:microsoft-dynamics-businesscentral/internal/extended/reports/Spend_Request_Document/6850/"/>
+    <ds:schemaRef ds:uri="urn:microsoft-dynamics-nav/reports/Spend_Request_Document/6850/"/>
   </ds:schemaRefs>
 </ds:datastoreItem>
 </file>
 
 <file path=customXml/itemProps2.xml><?xml version="1.0" encoding="utf-8"?>
-<ds:datastoreItem xmlns:ds="http://schemas.openxmlformats.org/officeDocument/2006/customXml" ds:itemID="{7828BD88-85FA-4D15-824F-B6C2963E083B}">
+<ds:datastoreItem xmlns:ds="http://schemas.openxmlformats.org/officeDocument/2006/customXml" ds:itemID="{0FA14807-1C08-4DEE-962E-4F4BB28529B6}">
   <ds:schemaRefs>
-    <ds:schemaRef ds:uri="urn:microsoft-dynamics-nav/reports/Spend_Request_Document/6850/"/>
+    <ds:schemaRef ds:uri="urn:microsoft-dynamics-businesscentral/internal/extended/reports/Spend_Request_Document/6850/"/>
   </ds:schemaRefs>
 </ds:datastoreItem>
 </file>

</xml_diff>

<commit_message>
Rename release to submit
</commit_message>
<xml_diff>
--- a/src/Layers/W1/BaseApp/Finance/SpendRequest/SpendRequestDocument.docx
+++ b/src/Layers/W1/BaseApp/Finance/SpendRequest/SpendRequestDocument.docx
@@ -9,8 +9,8 @@
       <w:sdt>
         <w:sdtPr>
           <w:alias w:val="ReportLbl"/>
-          <w:tag w:val="#BC:InsertDataItem,DataItems/SpendRequest/ReportLbl"/>
-          <w:id w:val="739986111"/>
+          <w:tag w:val="#BC:InsertDataItem,Labels/ReportLbl"/>
+          <w:id w:val="-565175143"/>
           <w:placeholder>
             <w:docPart w:val="DefaultPlaceholder_-1854013440"/>
           </w:placeholder>
@@ -53,12 +53,12 @@
         <w:tblStyle w:val="TableGrid"/>
         <w:tblW w:w="9643" w:type="dxa"/>
         <w:tblBorders>
-          <w:top w:val="none" w:color="auto" w:sz="0" w:space="0"/>
-          <w:left w:val="none" w:color="auto" w:sz="0" w:space="0"/>
-          <w:bottom w:val="none" w:color="auto" w:sz="0" w:space="0"/>
-          <w:right w:val="none" w:color="auto" w:sz="0" w:space="0"/>
-          <w:insideH w:val="none" w:color="auto" w:sz="0" w:space="0"/>
-          <w:insideV w:val="none" w:color="auto" w:sz="0" w:space="0"/>
+          <w:top w:val="none" w:sz="0" w:space="0" w:color="auto"/>
+          <w:left w:val="none" w:sz="0" w:space="0" w:color="auto"/>
+          <w:bottom w:val="none" w:sz="0" w:space="0" w:color="auto"/>
+          <w:right w:val="none" w:sz="0" w:space="0" w:color="auto"/>
+          <w:insideH w:val="none" w:sz="0" w:space="0" w:color="auto"/>
+          <w:insideV w:val="none" w:sz="0" w:space="0" w:color="auto"/>
         </w:tblBorders>
         <w:tblLayout w:type="fixed"/>
         <w:tblLook w:val="04A0" w:firstRow="1" w:lastRow="0" w:firstColumn="1" w:lastColumn="0" w:noHBand="0" w:noVBand="1"/>
@@ -578,8 +578,8 @@
     <w:sdt>
       <w:sdtPr>
         <w:alias w:val="DetailsHeaderLbl"/>
-        <w:tag w:val="#BC:InsertDataItem,DataItems/SpendRequest/DetailsHeaderLbl"/>
-        <w:id w:val="-1105646606"/>
+        <w:tag w:val="#BC:InsertDataItem,Labels/DetailsHeaderLbl"/>
+        <w:id w:val="1146173231"/>
         <w:placeholder>
           <w:docPart w:val="DefaultPlaceholder_-1854013440"/>
         </w:placeholder>
@@ -604,12 +604,12 @@
         <w:tblStyle w:val="GridTable1Light"/>
         <w:tblW w:w="0" w:type="auto"/>
         <w:tblBorders>
-          <w:top w:val="none" w:color="auto" w:sz="0" w:space="0"/>
-          <w:left w:val="none" w:color="auto" w:sz="0" w:space="0"/>
-          <w:bottom w:val="none" w:color="auto" w:sz="0" w:space="0"/>
-          <w:right w:val="none" w:color="auto" w:sz="0" w:space="0"/>
-          <w:insideH w:val="none" w:color="auto" w:sz="0" w:space="0"/>
-          <w:insideV w:val="none" w:color="auto" w:sz="0" w:space="0"/>
+          <w:top w:val="none" w:sz="0" w:space="0" w:color="auto"/>
+          <w:left w:val="none" w:sz="0" w:space="0" w:color="auto"/>
+          <w:bottom w:val="none" w:sz="0" w:space="0" w:color="auto"/>
+          <w:right w:val="none" w:sz="0" w:space="0" w:color="auto"/>
+          <w:insideH w:val="none" w:sz="0" w:space="0" w:color="auto"/>
+          <w:insideV w:val="none" w:sz="0" w:space="0" w:color="auto"/>
         </w:tblBorders>
         <w:tblLayout w:type="fixed"/>
         <w:tblLook w:val="04A0" w:firstRow="1" w:lastRow="0" w:firstColumn="1" w:lastColumn="0" w:noHBand="0" w:noVBand="1"/>
@@ -641,7 +641,7 @@
                 <w:cnfStyle w:val="001000000000" w:firstRow="0" w:lastRow="0" w:firstColumn="1" w:lastColumn="0" w:oddVBand="0" w:evenVBand="0" w:oddHBand="0" w:evenHBand="0" w:firstRowFirstColumn="0" w:firstRowLastColumn="0" w:lastRowFirstColumn="0" w:lastRowLastColumn="0"/>
                 <w:tcW w:w="4248" w:type="dxa"/>
                 <w:tcBorders>
-                  <w:bottom w:val="none" w:color="auto" w:sz="0" w:space="0"/>
+                  <w:bottom w:val="none" w:sz="0" w:space="0" w:color="auto"/>
                 </w:tcBorders>
               </w:tcPr>
               <w:p>
@@ -671,7 +671,7 @@
               <w:tcPr>
                 <w:tcW w:w="3260" w:type="dxa"/>
                 <w:tcBorders>
-                  <w:bottom w:val="none" w:color="auto" w:sz="0" w:space="0"/>
+                  <w:bottom w:val="none" w:sz="0" w:space="0" w:color="auto"/>
                 </w:tcBorders>
               </w:tcPr>
               <w:p>
@@ -705,7 +705,7 @@
               <w:tcPr>
                 <w:tcW w:w="2120" w:type="dxa"/>
                 <w:tcBorders>
-                  <w:bottom w:val="none" w:color="auto" w:sz="0" w:space="0"/>
+                  <w:bottom w:val="none" w:sz="0" w:space="0" w:color="auto"/>
                 </w:tcBorders>
               </w:tcPr>
               <w:p>
@@ -768,6 +768,12 @@
                     <w15:color w:val="808080"/>
                     <w:text/>
                   </w:sdtPr>
+                  <w:sdtEndPr>
+                    <w:rPr>
+                      <w:b/>
+                      <w:bCs/>
+                    </w:rPr>
+                  </w:sdtEndPr>
                   <w:sdtContent>
                     <w:tc>
                       <w:tcPr>
@@ -858,8 +864,8 @@
     <w:sdt>
       <w:sdtPr>
         <w:alias w:val="PostedEntriesHeaderLbl"/>
-        <w:tag w:val="#BC:InsertDataItem,DataItems/SpendRequest/PostedEntriesHeaderLbl"/>
-        <w:id w:val="1905953375"/>
+        <w:tag w:val="#BC:InsertDataItem,Labels/PostedEntriesHeaderLbl"/>
+        <w:id w:val="1627430073"/>
         <w:placeholder>
           <w:docPart w:val="DefaultPlaceholder_-1854013440"/>
         </w:placeholder>
@@ -884,12 +890,12 @@
         <w:tblStyle w:val="GridTable1Light"/>
         <w:tblW w:w="0" w:type="auto"/>
         <w:tblBorders>
-          <w:top w:val="none" w:color="auto" w:sz="0" w:space="0"/>
-          <w:left w:val="none" w:color="auto" w:sz="0" w:space="0"/>
-          <w:bottom w:val="none" w:color="auto" w:sz="0" w:space="0"/>
-          <w:right w:val="none" w:color="auto" w:sz="0" w:space="0"/>
-          <w:insideH w:val="none" w:color="auto" w:sz="0" w:space="0"/>
-          <w:insideV w:val="none" w:color="auto" w:sz="0" w:space="0"/>
+          <w:top w:val="none" w:sz="0" w:space="0" w:color="auto"/>
+          <w:left w:val="none" w:sz="0" w:space="0" w:color="auto"/>
+          <w:bottom w:val="none" w:sz="0" w:space="0" w:color="auto"/>
+          <w:right w:val="none" w:sz="0" w:space="0" w:color="auto"/>
+          <w:insideH w:val="none" w:sz="0" w:space="0" w:color="auto"/>
+          <w:insideV w:val="none" w:sz="0" w:space="0" w:color="auto"/>
         </w:tblBorders>
         <w:tblLayout w:type="fixed"/>
         <w:tblLook w:val="04A0" w:firstRow="1" w:lastRow="0" w:firstColumn="1" w:lastColumn="0" w:noHBand="0" w:noVBand="1"/>
@@ -921,7 +927,7 @@
                 <w:cnfStyle w:val="001000000000" w:firstRow="0" w:lastRow="0" w:firstColumn="1" w:lastColumn="0" w:oddVBand="0" w:evenVBand="0" w:oddHBand="0" w:evenHBand="0" w:firstRowFirstColumn="0" w:firstRowLastColumn="0" w:lastRowFirstColumn="0" w:lastRowLastColumn="0"/>
                 <w:tcW w:w="2010" w:type="dxa"/>
                 <w:tcBorders>
-                  <w:bottom w:val="none" w:color="auto" w:sz="0" w:space="0"/>
+                  <w:bottom w:val="none" w:sz="0" w:space="0" w:color="auto"/>
                 </w:tcBorders>
               </w:tcPr>
               <w:p>
@@ -950,7 +956,7 @@
               <w:tcPr>
                 <w:tcW w:w="1813" w:type="dxa"/>
                 <w:tcBorders>
-                  <w:bottom w:val="none" w:color="auto" w:sz="0" w:space="0"/>
+                  <w:bottom w:val="none" w:sz="0" w:space="0" w:color="auto"/>
                 </w:tcBorders>
               </w:tcPr>
               <w:p>
@@ -982,7 +988,7 @@
               <w:tcPr>
                 <w:tcW w:w="3555" w:type="dxa"/>
                 <w:tcBorders>
-                  <w:bottom w:val="none" w:color="auto" w:sz="0" w:space="0"/>
+                  <w:bottom w:val="none" w:sz="0" w:space="0" w:color="auto"/>
                 </w:tcBorders>
               </w:tcPr>
               <w:p>
@@ -1014,7 +1020,7 @@
               <w:tcPr>
                 <w:tcW w:w="2250" w:type="dxa"/>
                 <w:tcBorders>
-                  <w:bottom w:val="none" w:color="auto" w:sz="0" w:space="0"/>
+                  <w:bottom w:val="none" w:sz="0" w:space="0" w:color="auto"/>
                 </w:tcBorders>
               </w:tcPr>
               <w:p>
@@ -1063,12 +1069,6 @@
                 <w15:color w:val="808080"/>
                 <w:text/>
               </w:sdtPr>
-              <w:sdtEndPr>
-                <w:rPr>
-                  <w:b/>
-                  <w:bCs/>
-                </w:rPr>
-              </w:sdtEndPr>
               <w:sdtContent>
                 <w:tc>
                   <w:tcPr>
@@ -1375,7 +1375,7 @@
       <w:rPr>
         <w:noProof/>
       </w:rPr>
-      <w:t>2026-08-20</w:t>
+      <w:t>2026-08-21</w:t>
     </w:r>
     <w:r>
       <w:fldChar w:fldCharType="end"/>
@@ -2151,6 +2151,7 @@
 <file path=word/glossary/fontTable.xml><?xml version="1.0" encoding="utf-8"?>
 <w:fonts xmlns:mc="http://schemas.openxmlformats.org/markup-compatibility/2006" xmlns:r="http://schemas.openxmlformats.org/officeDocument/2006/relationships" xmlns:w="http://schemas.openxmlformats.org/wordprocessingml/2006/main" xmlns:w14="http://schemas.microsoft.com/office/word/2010/wordml" xmlns:w15="http://schemas.microsoft.com/office/word/2012/wordml" xmlns:w16cex="http://schemas.microsoft.com/office/word/2018/wordml/cex" xmlns:w16cid="http://schemas.microsoft.com/office/word/2016/wordml/cid" xmlns:w16="http://schemas.microsoft.com/office/word/2018/wordml" xmlns:w16du="http://schemas.microsoft.com/office/word/2023/wordml/word16du" xmlns:w16sdtdh="http://schemas.microsoft.com/office/word/2020/wordml/sdtdatahash" xmlns:w16sdtfl="http://schemas.microsoft.com/office/word/2024/wordml/sdtformatlock" xmlns:w16se="http://schemas.microsoft.com/office/word/2015/wordml/symex" mc:Ignorable="w14 w15 w16se w16cid w16 w16cex w16sdtdh w16sdtfl w16du">
   <w:font w:name="Aptos">
+    <w:altName w:val="Calibri"/>
     <w:charset w:val="00"/>
     <w:family w:val="swiss"/>
     <w:pitch w:val="variable"/>
@@ -2164,6 +2165,7 @@
     <w:sig w:usb0="E0002EFF" w:usb1="C000785B" w:usb2="00000009" w:usb3="00000000" w:csb0="000001FF" w:csb1="00000000"/>
   </w:font>
   <w:font w:name="Aptos Display">
+    <w:altName w:val="Calibri"/>
     <w:charset w:val="00"/>
     <w:family w:val="swiss"/>
     <w:pitch w:val="variable"/>
@@ -2176,6 +2178,7 @@
 <w:settings xmlns:mc="http://schemas.openxmlformats.org/markup-compatibility/2006" xmlns:o="urn:schemas-microsoft-com:office:office" xmlns:r="http://schemas.openxmlformats.org/officeDocument/2006/relationships" xmlns:m="http://schemas.openxmlformats.org/officeDocument/2006/math" xmlns:v="urn:schemas-microsoft-com:vml" xmlns:w10="urn:schemas-microsoft-com:office:word" xmlns:w="http://schemas.openxmlformats.org/wordprocessingml/2006/main" xmlns:w14="http://schemas.microsoft.com/office/word/2010/wordml" xmlns:w15="http://schemas.microsoft.com/office/word/2012/wordml" xmlns:w16cex="http://schemas.microsoft.com/office/word/2018/wordml/cex" xmlns:w16cid="http://schemas.microsoft.com/office/word/2016/wordml/cid" xmlns:w16="http://schemas.microsoft.com/office/word/2018/wordml" xmlns:w16du="http://schemas.microsoft.com/office/word/2023/wordml/word16du" xmlns:w16sdtdh="http://schemas.microsoft.com/office/word/2020/wordml/sdtdatahash" xmlns:w16sdtfl="http://schemas.microsoft.com/office/word/2024/wordml/sdtformatlock" xmlns:w16se="http://schemas.microsoft.com/office/word/2015/wordml/symex" xmlns:sl="http://schemas.openxmlformats.org/schemaLibrary/2006/main" mc:Ignorable="w14 w15 w16se w16cid w16 w16cex w16sdtdh w16sdtfl w16du">
   <w:view w:val="normal"/>
   <w:defaultTabStop w:val="720"/>
+  <w:hyphenationZone w:val="425"/>
   <w:characterSpacingControl w:val="doNotCompress"/>
   <w:compat>
     <w:useFELayout/>
@@ -2192,9 +2195,11 @@
     <w:rsid w:val="00133239"/>
     <w:rsid w:val="00263F54"/>
     <w:rsid w:val="002B726B"/>
+    <w:rsid w:val="003119E9"/>
     <w:rsid w:val="00432980"/>
     <w:rsid w:val="00625073"/>
     <w:rsid w:val="00673691"/>
+    <w:rsid w:val="008F576F"/>
     <w:rsid w:val="009075CB"/>
     <w:rsid w:val="00A145FE"/>
     <w:rsid w:val="00C12C56"/>
@@ -2993,7 +2998,7 @@
 
 <file path=word/webextensions/taskpanes.xml><?xml version="1.0" encoding="utf-8"?>
 <wetp:taskpanes xmlns:wetp="http://schemas.microsoft.com/office/webextensions/taskpanes/2010/11">
-  <wetp:taskpane dockstate="right" visibility="0" width="350" row="5">
+  <wetp:taskpane dockstate="right" visibility="0" width="704" row="0">
     <wetp:webextensionref xmlns:r="http://schemas.openxmlformats.org/officeDocument/2006/relationships" r:id="rId1"/>
   </wetp:taskpane>
 </wetp:taskpanes>
@@ -3011,9 +3016,7 @@
 </we:webextension>
 </file>
 
-<file path=customXml/item1.xml>��< ? x m l   v e r s i o n = " 1 . 0 "   e n c o d i n g = " u t f - 1 6 " ? > - 
- < N a v W o r d R e p o r t X m l P a r t   x m l n s = " u r n : m i c r o s o f t - d y n a m i c s - n a v / r e p o r t s / S p e n d _ R e q u e s t _ D o c u m e n t / 6 8 5 0 / " > +<file path=customXml/item1.xml>��< ? x m l   v e r s i o n = " 1 . 0 "   e n c o d i n g = " u t f - 1 6 " ? > < N a v W o r d R e p o r t X m l P a r t   x m l n s = " u r n : m i c r o s o f t - d y n a m i c s - b u s i n e s s c e n t r a l / i n t e r n a l / e x t e n d e d / r e p o r t s / S p e n d _ R e q u e s t _ D o c u m e n t / 6 8 5 0 / " >   
      < B C R e p o r t I n f o r m a t i o n >   
@@ -3159,121 +3162,123 @@
  
      < L a b e l s >   
-         < A p p r o v e d A t C a p t i o n > A p p r o v e d A t C a p t i o n < / A p p r o v e d A t C a p t i o n > - 
-         < A p p r o v e d B y U s e r N a m e C a p t i o n > A p p r o v e d B y U s e r N a m e C a p t i o n < / A p p r o v e d B y U s e r N a m e C a p t i o n > - 
-         < C u r r e n c y C o d e C a p t i o n > C u r r e n c y C o d e C a p t i o n < / C u r r e n c y C o d e C a p t i o n > - 
-         < D e s c r i p t i o n C a p t i o n > D e s c r i p t i o n C a p t i o n < / D e s c r i p t i o n C a p t i o n > - 
-         < D e t a i l G L A c c o u n t N o C a p t i o n > D e t a i l G L A c c o u n t N o C a p t i o n < / D e t a i l G L A c c o u n t N o C a p t i o n > - 
-         < E x p e c t e d A m o u n t C a p t i o n > E x p e c t e d A m o u n t C a p t i o n < / E x p e c t e d A m o u n t C a p t i o n > - 
-         < E x p e c t e d A m o u n t L C Y C a p t i o n > E x p e c t e d A m o u n t L C Y C a p t i o n < / E x p e c t e d A m o u n t L C Y C a p t i o n > - 
-         < E x p e c t e d E n d D a t e C a p t i o n > E x p e c t e d E n d D a t e C a p t i o n < / E x p e c t e d E n d D a t e C a p t i o n > - 
-         < E x p e c t e d S t a r t D a t e C a p t i o n > E x p e c t e d S t a r t D a t e C a p t i o n < / E x p e c t e d S t a r t D a t e C a p t i o n > - 
-         < G L A c c o u n t C a p t i o n > G L A c c o u n t C a p t i o n < / G L A c c o u n t C a p t i o n > - 
-         < G L A c c o u n t N o C a p t i o n > G L A c c o u n t N o C a p t i o n < / G L A c c o u n t N o C a p t i o n > - 
-         < L i n e C u r r e n c y C o d e C a p t i o n > L i n e C u r r e n c y C o d e C a p t i o n < / L i n e C u r r e n c y C o d e C a p t i o n > - 
-         < L i n e N o C a p t i o n > L i n e N o C a p t i o n < / L i n e N o C a p t i o n > - 
-         < N o C a p t i o n > N o C a p t i o n < / N o C a p t i o n > - 
-         < P o s t e d A m o u n t C a p t i o n > P o s t e d A m o u n t C a p t i o n < / P o s t e d A m o u n t C a p t i o n > - 
-         < P o s t e d D o c u m e n t N o C a p t i o n > P o s t e d D o c u m e n t N o C a p t i o n < / P o s t e d D o c u m e n t N o C a p t i o n > - 
-         < P o s t i n g D a t e C a p t i o n > P o s t i n g D a t e C a p t i o n < / P o s t i n g D a t e C a p t i o n > - 
-         < P o s t i n g D e s c r i p t i o n C a p t i o n > P o s t i n g D e s c r i p t i o n C a p t i o n < / P o s t i n g D e s c r i p t i o n C a p t i o n > - 
-         < P u r p o s e C a p t i o n > P u r p o s e C a p t i o n < / P u r p o s e C a p t i o n > - 
-         < R e q u e s t e d B y C a p t i o n > R e q u e s t e d B y C a p t i o n < / R e q u e s t e d B y C a p t i o n > - 
-         < S t a t u s C a p t i o n > S t a t u s C a p t i o n < / S t a t u s C a p t i o n > - 
-         < T o t a l E x p e c t e d A m o u n t C a p t i o n > T o t a l E x p e c t e d A m o u n t C a p t i o n < / T o t a l E x p e c t e d A m o u n t C a p t i o n > - 
-         < T o t a l E x p e c t e d A m o u n t L C Y C a p t i o n > T o t a l E x p e c t e d A m o u n t L C Y C a p t i o n < / T o t a l E x p e c t e d A m o u n t L C Y C a p t i o n > - 
-         < T o t a l S p e n t A m o u n t C a p t i o n > T o t a l S p e n t A m o u n t C a p t i o n < / T o t a l S p e n t A m o u n t C a p t i o n > +         < A p p r o v e d A t C a p t i o n   E l e m e n t T y p e = " P a r a m e t e r "   E l e m e n t I d = " 1 9 3 9 5 6 7 7 8 1 "   D a t a T y p e = " S t r i n g " > A p p r o v e d A t C a p t i o n < / A p p r o v e d A t C a p t i o n > + 
+         < A p p r o v e d B y U s e r N a m e C a p t i o n   E l e m e n t T y p e = " P a r a m e t e r "   E l e m e n t I d = " 1 7 2 2 9 6 4 0 6 1 "   D a t a T y p e = " S t r i n g " > A p p r o v e d B y U s e r N a m e C a p t i o n < / A p p r o v e d B y U s e r N a m e C a p t i o n > + 
+         < C u r r e n c y C o d e C a p t i o n   E l e m e n t T y p e = " P a r a m e t e r "   E l e m e n t I d = " 1 5 7 9 5 9 5 9 2 1 "   D a t a T y p e = " S t r i n g " > C u r r e n c y C o d e C a p t i o n < / C u r r e n c y C o d e C a p t i o n > + 
+         < D e s c r i p t i o n C a p t i o n   E l e m e n t T y p e = " P a r a m e t e r "   E l e m e n t I d = " 1 3 1 4 3 5 1 3 0 7 "   D a t a T y p e = " S t r i n g " > D e s c r i p t i o n C a p t i o n < / D e s c r i p t i o n C a p t i o n > + 
+         < D e t a i l G L A c c o u n t N o C a p t i o n   E l e m e n t T y p e = " P a r a m e t e r "   E l e m e n t I d = " 6 9 2 9 9 7 5 9 3 "   D a t a T y p e = " S t r i n g " > D e t a i l G L A c c o u n t N o C a p t i o n < / D e t a i l G L A c c o u n t N o C a p t i o n > + 
+         < D e t a i l s H e a d e r L b l   E l e m e n t T y p e = " P a r a m e t e r "   E l e m e n t I d = " 1 5 6 2 3 0 7 8 7 8 "   D a t a T y p e = " S t r i n g " > D e t a i l s H e a d e r L b l < / D e t a i l s H e a d e r L b l > + 
+         < E m p l o y e e F u l l N a m e L b l   E l e m e n t T y p e = " P a r a m e t e r "   E l e m e n t I d = " 1 5 5 9 4 3 9 2 2 3 "   D a t a T y p e = " S t r i n g " > E m p l o y e e F u l l N a m e L b l < / E m p l o y e e F u l l N a m e L b l > + 
+         < E x p e c t e d A m o u n t C a p t i o n   E l e m e n t T y p e = " P a r a m e t e r "   E l e m e n t I d = " 1 3 0 0 9 6 8 5 2 9 "   D a t a T y p e = " S t r i n g " > E x p e c t e d A m o u n t C a p t i o n < / E x p e c t e d A m o u n t C a p t i o n > + 
+         < E x p e c t e d A m o u n t L C Y C a p t i o n   E l e m e n t T y p e = " P a r a m e t e r "   E l e m e n t I d = " 1 6 8 3 8 8 4 3 7 5 "   D a t a T y p e = " S t r i n g " > E x p e c t e d A m o u n t L C Y C a p t i o n < / E x p e c t e d A m o u n t L C Y C a p t i o n > + 
+         < E x p e c t e d E n d D a t e C a p t i o n   E l e m e n t T y p e = " P a r a m e t e r "   E l e m e n t I d = " 7 7 8 2 4 2 0 8 8 "   D a t a T y p e = " S t r i n g " > E x p e c t e d E n d D a t e C a p t i o n < / E x p e c t e d E n d D a t e C a p t i o n > + 
+         < E x p e c t e d S t a r t D a t e C a p t i o n   E l e m e n t T y p e = " P a r a m e t e r "   E l e m e n t I d = " 1 0 1 8 6 6 7 3 7 "   D a t a T y p e = " S t r i n g " > E x p e c t e d S t a r t D a t e C a p t i o n < / E x p e c t e d S t a r t D a t e C a p t i o n > + 
+         < G L A c c o u n t C a p t i o n   E l e m e n t T y p e = " P a r a m e t e r "   E l e m e n t I d = " 1 0 8 2 4 4 8 6 9 7 "   D a t a T y p e = " S t r i n g " > G L A c c o u n t C a p t i o n < / G L A c c o u n t C a p t i o n > + 
+         < G L A c c o u n t N o C a p t i o n   E l e m e n t T y p e = " P a r a m e t e r "   E l e m e n t I d = " 8 8 6 6 5 8 9 3 0 "   D a t a T y p e = " S t r i n g " > G L A c c o u n t N o C a p t i o n < / G L A c c o u n t N o C a p t i o n > + 
+         < L i n e C u r r e n c y C o d e C a p t i o n   E l e m e n t T y p e = " P a r a m e t e r "   E l e m e n t I d = " 1 5 4 8 1 3 3 5 8 3 "   D a t a T y p e = " S t r i n g " > L i n e C u r r e n c y C o d e C a p t i o n < / L i n e C u r r e n c y C o d e C a p t i o n > + 
+         < L i n e N o C a p t i o n   E l e m e n t T y p e = " P a r a m e t e r "   E l e m e n t I d = " 9 8 1 5 1 4 5 2 6 "   D a t a T y p e = " S t r i n g " > L i n e N o C a p t i o n < / L i n e N o C a p t i o n > + 
+         < N o C a p t i o n   E l e m e n t T y p e = " P a r a m e t e r "   E l e m e n t I d = " 1 1 9 8 2 6 8 3 4 0 "   D a t a T y p e = " S t r i n g " > N o C a p t i o n < / N o C a p t i o n > + 
+         < P o s t e d A m o u n t C a p t i o n   E l e m e n t T y p e = " P a r a m e t e r "   E l e m e n t I d = " 9 6 0 3 0 2 3 1 2 "   D a t a T y p e = " S t r i n g " > P o s t e d A m o u n t C a p t i o n < / P o s t e d A m o u n t C a p t i o n > + 
+         < P o s t e d D o c u m e n t N o C a p t i o n   E l e m e n t T y p e = " P a r a m e t e r "   E l e m e n t I d = " 1 3 3 5 5 3 9 9 4 "   D a t a T y p e = " S t r i n g " > P o s t e d D o c u m e n t N o C a p t i o n < / P o s t e d D o c u m e n t N o C a p t i o n > + 
+         < P o s t e d E n t r i e s H e a d e r L b l   E l e m e n t T y p e = " P a r a m e t e r "   E l e m e n t I d = " 2 6 3 4 4 2 8 0 3 "   D a t a T y p e = " S t r i n g " > P o s t e d E n t r i e s H e a d e r L b l < / P o s t e d E n t r i e s H e a d e r L b l > + 
+         < P o s t i n g D a t e C a p t i o n   E l e m e n t T y p e = " P a r a m e t e r "   E l e m e n t I d = " 8 8 9 9 5 5 3 3 7 "   D a t a T y p e = " S t r i n g " > P o s t i n g D a t e C a p t i o n < / P o s t i n g D a t e C a p t i o n > + 
+         < P o s t i n g D e s c r i p t i o n C a p t i o n   E l e m e n t T y p e = " P a r a m e t e r "   E l e m e n t I d = " 6 0 7 8 7 4 6 0 5 "   D a t a T y p e = " S t r i n g " > P o s t i n g D e s c r i p t i o n C a p t i o n < / P o s t i n g D e s c r i p t i o n C a p t i o n > + 
+         < P u r p o s e C a p t i o n   E l e m e n t T y p e = " P a r a m e t e r "   E l e m e n t I d = " 3 1 3 1 5 8 9 0 9 "   D a t a T y p e = " S t r i n g " > P u r p o s e C a p t i o n < / P u r p o s e C a p t i o n > + 
+         < R e p o r t L b l   E l e m e n t T y p e = " P a r a m e t e r "   E l e m e n t I d = " 4 6 0 2 0 4 4 3 1 "   D a t a T y p e = " S t r i n g " > R e p o r t L b l < / R e p o r t L b l > + 
+         < R e q u e s t e d B y C a p t i o n   E l e m e n t T y p e = " P a r a m e t e r "   E l e m e n t I d = " 9 4 6 3 9 1 6 9 8 "   D a t a T y p e = " S t r i n g " > R e q u e s t e d B y C a p t i o n < / R e q u e s t e d B y C a p t i o n > + 
+         < S t a t u s C a p t i o n   E l e m e n t T y p e = " P a r a m e t e r "   E l e m e n t I d = " 1 6 3 4 1 4 4 5 5 1 "   D a t a T y p e = " S t r i n g " > S t a t u s C a p t i o n < / S t a t u s C a p t i o n > + 
+         < T o t a l E x p e c t e d A m o u n t C a p t i o n   E l e m e n t T y p e = " P a r a m e t e r "   E l e m e n t I d = " 1 8 9 2 8 2 9 1 7 3 "   D a t a T y p e = " S t r i n g " > T o t a l E x p e c t e d A m o u n t C a p t i o n < / T o t a l E x p e c t e d A m o u n t C a p t i o n > + 
+         < T o t a l E x p e c t e d A m o u n t L C Y C a p t i o n   E l e m e n t T y p e = " P a r a m e t e r "   E l e m e n t I d = " 1 1 8 4 1 5 6 0 6 7 "   D a t a T y p e = " S t r i n g " > T o t a l E x p e c t e d A m o u n t L C Y C a p t i o n < / T o t a l E x p e c t e d A m o u n t L C Y C a p t i o n > + 
+         < T o t a l S p e n t A m o u n t C a p t i o n   E l e m e n t T y p e = " P a r a m e t e r "   E l e m e n t I d = " 1 3 9 8 8 1 4 0 5 5 "   D a t a T y p e = " S t r i n g " > T o t a l S p e n t A m o u n t C a p t i o n < / T o t a l S p e n t A m o u n t C a p t i o n >   
      < / L a b e l s >   
-     < S p e n d R e q u e s t > - 
-         < A p p r o v e d A t > A p p r o v e d A t < / A p p r o v e d A t > - 
-         < A p p r o v e d B y U s e r N a m e > A p p r o v e d B y U s e r N a m e < / A p p r o v e d B y U s e r N a m e > - 
-         < C u r r e n c y C o d e > C u r r e n c y C o d e < / C u r r e n c y C o d e > - 
-         < D e t a i l s H e a d e r L b l > D e t a i l s H e a d e r L b l < / D e t a i l s H e a d e r L b l > - 
-         < E m p l o y e e F u l l N a m e L b l > E m p l o y e e F u l l N a m e L b l < / E m p l o y e e F u l l N a m e L b l > - 
-         < E m p l o y e e N a m e > E m p l o y e e N a m e < / E m p l o y e e N a m e > - 
-         < E x p e c t e d E n d D a t e > E x p e c t e d E n d D a t e < / E x p e c t e d E n d D a t e > - 
-         < E x p e c t e d S t a r t D a t e > E x p e c t e d S t a r t D a t e < / E x p e c t e d S t a r t D a t e > - 
-         < G L A c c o u n t N o > G L A c c o u n t N o < / G L A c c o u n t N o > - 
-         < N o > N o < / N o > - 
-         < P o s t e d E n t r i e s H e a d e r L b l > P o s t e d E n t r i e s H e a d e r L b l < / P o s t e d E n t r i e s H e a d e r L b l > - 
-         < P u r p o s e > P u r p o s e < / P u r p o s e > - 
-         < R e p o r t L b l > R e p o r t L b l < / R e p o r t L b l > - 
-         < R e q u e s t e d B y > R e q u e s t e d B y < / R e q u e s t e d B y > - 
-         < S t a t u s > S t a t u s < / S t a t u s > - 
-         < T o t a l E x p e c t e d A m o u n t > T o t a l E x p e c t e d A m o u n t < / T o t a l E x p e c t e d A m o u n t > - 
-         < T o t a l E x p e c t e d A m o u n t L C Y > T o t a l E x p e c t e d A m o u n t L C Y < / T o t a l E x p e c t e d A m o u n t L C Y > - 
-         < T o t a l S p e n t A m o u n t > T o t a l S p e n t A m o u n t < / T o t a l S p e n t A m o u n t > - 
-         < S p e n d R e q u e s t D e t a i l > - 
-             < D e s c r i p t i o n > D e s c r i p t i o n < / D e s c r i p t i o n > - 
-             < D e t a i l G L A c c o u n t N o > D e t a i l G L A c c o u n t N o < / D e t a i l G L A c c o u n t N o > - 
-             < E x p e c t e d A m o u n t > E x p e c t e d A m o u n t < / E x p e c t e d A m o u n t > - 
-             < E x p e c t e d A m o u n t L C Y > E x p e c t e d A m o u n t L C Y < / E x p e c t e d A m o u n t L C Y > - 
-             < L i n e C u r r e n c y C o d e > L i n e C u r r e n c y C o d e < / L i n e C u r r e n c y C o d e > - 
-             < L i n e N o > L i n e N o < / L i n e N o > +     < T o o l t i p s / > + 
+     < S p e n d R e q u e s t   E l e m e n t T y p e = " D a t a I t e m "   E l e m e n t I d = " 1 2 2 6 9 2 1 9 1 2 " > + 
+         < A p p r o v e d A t   E l e m e n t T y p e = " C o l u m n "   E l e m e n t I d = " 1 9 3 9 5 6 7 7 8 1 "   D a t a T y p e = " D a t e T i m e " > A p p r o v e d A t < / A p p r o v e d A t > + 
+         < A p p r o v e d B y U s e r N a m e   E l e m e n t T y p e = " C o l u m n "   E l e m e n t I d = " 1 7 2 2 9 6 4 0 6 1 "   D a t a T y p e = " C o d e " > A p p r o v e d B y U s e r N a m e < / A p p r o v e d B y U s e r N a m e > + 
+         < C u r r e n c y C o d e   E l e m e n t T y p e = " C o l u m n "   E l e m e n t I d = " 1 5 7 9 5 9 5 9 2 1 "   D a t a T y p e = " C o d e " > C u r r e n c y C o d e < / C u r r e n c y C o d e > + 
+         < E m p l o y e e N a m e   E l e m e n t T y p e = " C o l u m n "   E l e m e n t I d = " 1 2 8 6 7 8 4 2 3 2 "   D a t a T y p e = " T e x t " > E m p l o y e e N a m e < / E m p l o y e e N a m e > + 
+         < E x p e c t e d E n d D a t e   E l e m e n t T y p e = " C o l u m n "   E l e m e n t I d = " 7 7 8 2 4 2 0 8 8 "   D a t a T y p e = " D a t e " > E x p e c t e d E n d D a t e < / E x p e c t e d E n d D a t e > + 
+         < E x p e c t e d S t a r t D a t e   E l e m e n t T y p e = " C o l u m n "   E l e m e n t I d = " 1 0 1 8 6 6 7 3 7 "   D a t a T y p e = " D a t e " > E x p e c t e d S t a r t D a t e < / E x p e c t e d S t a r t D a t e > + 
+         < G L A c c o u n t N o   E l e m e n t T y p e = " C o l u m n "   E l e m e n t I d = " 8 8 6 6 5 8 9 3 0 "   D a t a T y p e = " C o d e " > G L A c c o u n t N o < / G L A c c o u n t N o > + 
+         < N o   E l e m e n t T y p e = " C o l u m n "   E l e m e n t I d = " 1 1 9 8 2 6 8 3 4 0 "   D a t a T y p e = " C o d e " > N o < / N o > + 
+         < P u r p o s e   E l e m e n t T y p e = " C o l u m n "   E l e m e n t I d = " 3 1 3 1 5 8 9 0 9 "   D a t a T y p e = " T e x t " > P u r p o s e < / P u r p o s e > + 
+         < R e q u e s t e d B y   E l e m e n t T y p e = " C o l u m n "   E l e m e n t I d = " 9 4 6 3 9 1 6 9 8 "   D a t a T y p e = " C o d e " > R e q u e s t e d B y < / R e q u e s t e d B y > + 
+         < S t a t u s   E l e m e n t T y p e = " C o l u m n "   E l e m e n t I d = " 1 6 3 4 1 4 4 5 5 1 "   D a t a T y p e = " O p t i o n " > S t a t u s < / S t a t u s > + 
+         < T o t a l E x p e c t e d A m o u n t   E l e m e n t T y p e = " C o l u m n "   E l e m e n t I d = " 1 8 9 2 8 2 9 1 7 3 "   D a t a T y p e = " D e c i m a l " > T o t a l E x p e c t e d A m o u n t < / T o t a l E x p e c t e d A m o u n t > + 
+         < T o t a l E x p e c t e d A m o u n t L C Y   E l e m e n t T y p e = " C o l u m n "   E l e m e n t I d = " 1 1 8 4 1 5 6 0 6 7 "   D a t a T y p e = " D e c i m a l " > T o t a l E x p e c t e d A m o u n t L C Y < / T o t a l E x p e c t e d A m o u n t L C Y > + 
+         < T o t a l S p e n t A m o u n t   E l e m e n t T y p e = " C o l u m n "   E l e m e n t I d = " 1 3 9 8 8 1 4 0 5 5 "   D a t a T y p e = " D e c i m a l " > T o t a l S p e n t A m o u n t < / T o t a l S p e n t A m o u n t > + 
+         < S p e n d R e q u e s t D e t a i l   E l e m e n t T y p e = " D a t a I t e m "   E l e m e n t I d = " 1 0 7 7 5 5 8 4 7 " > + 
+             < D e s c r i p t i o n   E l e m e n t T y p e = " C o l u m n "   E l e m e n t I d = " 1 3 1 4 3 5 1 3 0 7 "   D a t a T y p e = " T e x t " > D e s c r i p t i o n < / D e s c r i p t i o n > + 
+             < D e t a i l G L A c c o u n t N o   E l e m e n t T y p e = " C o l u m n "   E l e m e n t I d = " 6 9 2 9 9 7 5 9 3 "   D a t a T y p e = " C o d e " > D e t a i l G L A c c o u n t N o < / D e t a i l G L A c c o u n t N o > + 
+             < E x p e c t e d A m o u n t   E l e m e n t T y p e = " C o l u m n "   E l e m e n t I d = " 1 3 0 0 9 6 8 5 2 9 "   D a t a T y p e = " D e c i m a l " > E x p e c t e d A m o u n t < / E x p e c t e d A m o u n t > + 
+             < E x p e c t e d A m o u n t L C Y   E l e m e n t T y p e = " C o l u m n "   E l e m e n t I d = " 1 6 8 3 8 8 4 3 7 5 "   D a t a T y p e = " D e c i m a l " > E x p e c t e d A m o u n t L C Y < / E x p e c t e d A m o u n t L C Y > + 
+             < L i n e C u r r e n c y C o d e   E l e m e n t T y p e = " C o l u m n "   E l e m e n t I d = " 1 5 4 8 1 3 3 5 8 3 "   D a t a T y p e = " C o d e " > L i n e C u r r e n c y C o d e < / L i n e C u r r e n c y C o d e > + 
+             < L i n e N o   E l e m e n t T y p e = " C o l u m n "   E l e m e n t I d = " 9 8 1 5 1 4 5 2 6 "   D a t a T y p e = " I n t e g e r " > L i n e N o < / L i n e N o >   
          < / S p e n d R e q u e s t D e t a i l >   
-         < S p e n d R e q u e s t G L E n t r i e s > - 
-             < G L A c c o u n t > G L A c c o u n t < / G L A c c o u n t > - 
-             < P o s t e d A m o u n t > P o s t e d A m o u n t < / P o s t e d A m o u n t > - 
-             < P o s t e d D o c u m e n t N o > P o s t e d D o c u m e n t N o < / P o s t e d D o c u m e n t N o > - 
-             < P o s t i n g D a t e > P o s t i n g D a t e < / P o s t i n g D a t e > - 
-             < P o s t i n g D e s c r i p t i o n > P o s t i n g D e s c r i p t i o n < / P o s t i n g D e s c r i p t i o n > +         < S p e n d R e q u e s t G L E n t r i e s   E l e m e n t T y p e = " D a t a I t e m "   E l e m e n t I d = " 9 3 4 1 0 6 3 8 5 " > + 
+             < G L A c c o u n t   E l e m e n t T y p e = " C o l u m n "   E l e m e n t I d = " 1 0 8 2 4 4 8 6 9 7 "   D a t a T y p e = " C o d e " > G L A c c o u n t < / G L A c c o u n t > + 
+             < P o s t e d A m o u n t   E l e m e n t T y p e = " C o l u m n "   E l e m e n t I d = " 9 6 0 3 0 2 3 1 2 "   D a t a T y p e = " D e c i m a l " > P o s t e d A m o u n t < / P o s t e d A m o u n t > + 
+             < P o s t e d D o c u m e n t N o   E l e m e n t T y p e = " C o l u m n "   E l e m e n t I d = " 1 3 3 5 5 3 9 9 4 "   D a t a T y p e = " C o d e " > P o s t e d D o c u m e n t N o < / P o s t e d D o c u m e n t N o > + 
+             < P o s t i n g D a t e   E l e m e n t T y p e = " C o l u m n "   E l e m e n t I d = " 8 8 9 9 5 5 3 3 7 "   D a t a T y p e = " D a t e " > P o s t i n g D a t e < / P o s t i n g D a t e > + 
+             < P o s t i n g D e s c r i p t i o n   E l e m e n t T y p e = " C o l u m n "   E l e m e n t I d = " 6 0 7 8 7 4 6 0 5 "   D a t a T y p e = " T e x t " > P o s t i n g D e s c r i p t i o n < / P o s t i n g D e s c r i p t i o n >   
          < / S p e n d R e q u e s t G L E n t r i e s >   
@@ -3282,9 +3287,7 @@
  < / N a v W o r d R e p o r t X m l P a r t > 
 </file>
 
-<file path=customXml/item2.xml>��< ? x m l   v e r s i o n = " 1 . 0 "   e n c o d i n g = " u t f - 1 6 " ? > - 
- < N a v W o r d R e p o r t X m l P a r t   x m l n s = " u r n : m i c r o s o f t - d y n a m i c s - b u s i n e s s c e n t r a l / i n t e r n a l / e x t e n d e d / r e p o r t s / S p e n d _ R e q u e s t _ D o c u m e n t / 6 8 5 0 / " > +<file path=customXml/item2.xml>��< ? x m l   v e r s i o n = " 1 . 0 "   e n c o d i n g = " u t f - 1 6 " ? > < N a v W o r d R e p o r t X m l P a r t   x m l n s = " u r n : m i c r o s o f t - d y n a m i c s - n a v / r e p o r t s / S p e n d _ R e q u e s t _ D o c u m e n t / 6 8 5 0 / " >   
      < B C R e p o r t I n f o r m a t i o n >   
@@ -3430,123 +3433,121 @@
  
      < L a b e l s >   
-         < A p p r o v e d A t C a p t i o n   E l e m e n t T y p e = " P a r a m e t e r "   E l e m e n t I d = " 1 9 3 9 5 6 7 7 8 1 "   D a t a T y p e = " S t r i n g " > A p p r o v e d A t C a p t i o n < / A p p r o v e d A t C a p t i o n > - 
-         < A p p r o v e d B y U s e r N a m e C a p t i o n   E l e m e n t T y p e = " P a r a m e t e r "   E l e m e n t I d = " 1 7 2 2 9 6 4 0 6 1 "   D a t a T y p e = " S t r i n g " > A p p r o v e d B y U s e r N a m e C a p t i o n < / A p p r o v e d B y U s e r N a m e C a p t i o n > - 
-         < C u r r e n c y C o d e C a p t i o n   E l e m e n t T y p e = " P a r a m e t e r "   E l e m e n t I d = " 1 5 7 9 5 9 5 9 2 1 "   D a t a T y p e = " S t r i n g " > C u r r e n c y C o d e C a p t i o n < / C u r r e n c y C o d e C a p t i o n > - 
-         < D e s c r i p t i o n C a p t i o n   E l e m e n t T y p e = " P a r a m e t e r "   E l e m e n t I d = " 1 3 1 4 3 5 1 3 0 7 "   D a t a T y p e = " S t r i n g " > D e s c r i p t i o n C a p t i o n < / D e s c r i p t i o n C a p t i o n > - 
-         < D e t a i l G L A c c o u n t N o C a p t i o n   E l e m e n t T y p e = " P a r a m e t e r "   E l e m e n t I d = " 6 9 2 9 9 7 5 9 3 "   D a t a T y p e = " S t r i n g " > D e t a i l G L A c c o u n t N o C a p t i o n < / D e t a i l G L A c c o u n t N o C a p t i o n > - 
-         < E x p e c t e d A m o u n t C a p t i o n   E l e m e n t T y p e = " P a r a m e t e r "   E l e m e n t I d = " 1 3 0 0 9 6 8 5 2 9 "   D a t a T y p e = " S t r i n g " > E x p e c t e d A m o u n t C a p t i o n < / E x p e c t e d A m o u n t C a p t i o n > - 
-         < E x p e c t e d A m o u n t L C Y C a p t i o n   E l e m e n t T y p e = " P a r a m e t e r "   E l e m e n t I d = " 1 6 8 3 8 8 4 3 7 5 "   D a t a T y p e = " S t r i n g " > E x p e c t e d A m o u n t L C Y C a p t i o n < / E x p e c t e d A m o u n t L C Y C a p t i o n > - 
-         < E x p e c t e d E n d D a t e C a p t i o n   E l e m e n t T y p e = " P a r a m e t e r "   E l e m e n t I d = " 7 7 8 2 4 2 0 8 8 "   D a t a T y p e = " S t r i n g " > E x p e c t e d E n d D a t e C a p t i o n < / E x p e c t e d E n d D a t e C a p t i o n > - 
-         < E x p e c t e d S t a r t D a t e C a p t i o n   E l e m e n t T y p e = " P a r a m e t e r "   E l e m e n t I d = " 1 0 1 8 6 6 7 3 7 "   D a t a T y p e = " S t r i n g " > E x p e c t e d S t a r t D a t e C a p t i o n < / E x p e c t e d S t a r t D a t e C a p t i o n > - 
-         < G L A c c o u n t C a p t i o n   E l e m e n t T y p e = " P a r a m e t e r "   E l e m e n t I d = " 1 0 8 2 4 4 8 6 9 7 "   D a t a T y p e = " S t r i n g " > G L A c c o u n t C a p t i o n < / G L A c c o u n t C a p t i o n > - 
-         < G L A c c o u n t N o C a p t i o n   E l e m e n t T y p e = " P a r a m e t e r "   E l e m e n t I d = " 8 8 6 6 5 8 9 3 0 "   D a t a T y p e = " S t r i n g " > G L A c c o u n t N o C a p t i o n < / G L A c c o u n t N o C a p t i o n > - 
-         < L i n e C u r r e n c y C o d e C a p t i o n   E l e m e n t T y p e = " P a r a m e t e r "   E l e m e n t I d = " 1 5 4 8 1 3 3 5 8 3 "   D a t a T y p e = " S t r i n g " > L i n e C u r r e n c y C o d e C a p t i o n < / L i n e C u r r e n c y C o d e C a p t i o n > - 
-         < L i n e N o C a p t i o n   E l e m e n t T y p e = " P a r a m e t e r "   E l e m e n t I d = " 9 8 1 5 1 4 5 2 6 "   D a t a T y p e = " S t r i n g " > L i n e N o C a p t i o n < / L i n e N o C a p t i o n > - 
-         < N o C a p t i o n   E l e m e n t T y p e = " P a r a m e t e r "   E l e m e n t I d = " 1 1 9 8 2 6 8 3 4 0 "   D a t a T y p e = " S t r i n g " > N o C a p t i o n < / N o C a p t i o n > - 
-         < P o s t e d A m o u n t C a p t i o n   E l e m e n t T y p e = " P a r a m e t e r "   E l e m e n t I d = " 9 6 0 3 0 2 3 1 2 "   D a t a T y p e = " S t r i n g " > P o s t e d A m o u n t C a p t i o n < / P o s t e d A m o u n t C a p t i o n > - 
-         < P o s t e d D o c u m e n t N o C a p t i o n   E l e m e n t T y p e = " P a r a m e t e r "   E l e m e n t I d = " 1 3 3 5 5 3 9 9 4 "   D a t a T y p e = " S t r i n g " > P o s t e d D o c u m e n t N o C a p t i o n < / P o s t e d D o c u m e n t N o C a p t i o n > - 
-         < P o s t i n g D a t e C a p t i o n   E l e m e n t T y p e = " P a r a m e t e r "   E l e m e n t I d = " 8 8 9 9 5 5 3 3 7 "   D a t a T y p e = " S t r i n g " > P o s t i n g D a t e C a p t i o n < / P o s t i n g D a t e C a p t i o n > - 
-         < P o s t i n g D e s c r i p t i o n C a p t i o n   E l e m e n t T y p e = " P a r a m e t e r "   E l e m e n t I d = " 6 0 7 8 7 4 6 0 5 "   D a t a T y p e = " S t r i n g " > P o s t i n g D e s c r i p t i o n C a p t i o n < / P o s t i n g D e s c r i p t i o n C a p t i o n > - 
-         < P u r p o s e C a p t i o n   E l e m e n t T y p e = " P a r a m e t e r "   E l e m e n t I d = " 3 1 3 1 5 8 9 0 9 "   D a t a T y p e = " S t r i n g " > P u r p o s e C a p t i o n < / P u r p o s e C a p t i o n > - 
-         < R e q u e s t e d B y C a p t i o n   E l e m e n t T y p e = " P a r a m e t e r "   E l e m e n t I d = " 9 4 6 3 9 1 6 9 8 "   D a t a T y p e = " S t r i n g " > R e q u e s t e d B y C a p t i o n < / R e q u e s t e d B y C a p t i o n > - 
-         < S t a t u s C a p t i o n   E l e m e n t T y p e = " P a r a m e t e r "   E l e m e n t I d = " 1 6 3 4 1 4 4 5 5 1 "   D a t a T y p e = " S t r i n g " > S t a t u s C a p t i o n < / S t a t u s C a p t i o n > - 
-         < T o t a l E x p e c t e d A m o u n t C a p t i o n   E l e m e n t T y p e = " P a r a m e t e r "   E l e m e n t I d = " 1 8 9 2 8 2 9 1 7 3 "   D a t a T y p e = " S t r i n g " > T o t a l E x p e c t e d A m o u n t C a p t i o n < / T o t a l E x p e c t e d A m o u n t C a p t i o n > - 
-         < T o t a l E x p e c t e d A m o u n t L C Y C a p t i o n   E l e m e n t T y p e = " P a r a m e t e r "   E l e m e n t I d = " 1 1 8 4 1 5 6 0 6 7 "   D a t a T y p e = " S t r i n g " > T o t a l E x p e c t e d A m o u n t L C Y C a p t i o n < / T o t a l E x p e c t e d A m o u n t L C Y C a p t i o n > - 
-         < T o t a l S p e n t A m o u n t C a p t i o n   E l e m e n t T y p e = " P a r a m e t e r "   E l e m e n t I d = " 1 3 9 8 8 1 4 0 5 5 "   D a t a T y p e = " S t r i n g " > T o t a l S p e n t A m o u n t C a p t i o n < / T o t a l S p e n t A m o u n t C a p t i o n > +         < A p p r o v e d A t C a p t i o n > A p p r o v e d A t C a p t i o n < / A p p r o v e d A t C a p t i o n > + 
+         < A p p r o v e d B y U s e r N a m e C a p t i o n > A p p r o v e d B y U s e r N a m e C a p t i o n < / A p p r o v e d B y U s e r N a m e C a p t i o n > + 
+         < C u r r e n c y C o d e C a p t i o n > C u r r e n c y C o d e C a p t i o n < / C u r r e n c y C o d e C a p t i o n > + 
+         < D e s c r i p t i o n C a p t i o n > D e s c r i p t i o n C a p t i o n < / D e s c r i p t i o n C a p t i o n > + 
+         < D e t a i l G L A c c o u n t N o C a p t i o n > D e t a i l G L A c c o u n t N o C a p t i o n < / D e t a i l G L A c c o u n t N o C a p t i o n > + 
+         < D e t a i l s H e a d e r L b l > D e t a i l s H e a d e r L b l < / D e t a i l s H e a d e r L b l > + 
+         < E m p l o y e e F u l l N a m e L b l > E m p l o y e e F u l l N a m e L b l < / E m p l o y e e F u l l N a m e L b l > + 
+         < E x p e c t e d A m o u n t C a p t i o n > E x p e c t e d A m o u n t C a p t i o n < / E x p e c t e d A m o u n t C a p t i o n > + 
+         < E x p e c t e d A m o u n t L C Y C a p t i o n > E x p e c t e d A m o u n t L C Y C a p t i o n < / E x p e c t e d A m o u n t L C Y C a p t i o n > + 
+         < E x p e c t e d E n d D a t e C a p t i o n > E x p e c t e d E n d D a t e C a p t i o n < / E x p e c t e d E n d D a t e C a p t i o n > + 
+         < E x p e c t e d S t a r t D a t e C a p t i o n > E x p e c t e d S t a r t D a t e C a p t i o n < / E x p e c t e d S t a r t D a t e C a p t i o n > + 
+         < G L A c c o u n t C a p t i o n > G L A c c o u n t C a p t i o n < / G L A c c o u n t C a p t i o n > + 
+         < G L A c c o u n t N o C a p t i o n > G L A c c o u n t N o C a p t i o n < / G L A c c o u n t N o C a p t i o n > + 
+         < L i n e C u r r e n c y C o d e C a p t i o n > L i n e C u r r e n c y C o d e C a p t i o n < / L i n e C u r r e n c y C o d e C a p t i o n > + 
+         < L i n e N o C a p t i o n > L i n e N o C a p t i o n < / L i n e N o C a p t i o n > + 
+         < N o C a p t i o n > N o C a p t i o n < / N o C a p t i o n > + 
+         < P o s t e d A m o u n t C a p t i o n > P o s t e d A m o u n t C a p t i o n < / P o s t e d A m o u n t C a p t i o n > + 
+         < P o s t e d D o c u m e n t N o C a p t i o n > P o s t e d D o c u m e n t N o C a p t i o n < / P o s t e d D o c u m e n t N o C a p t i o n > + 
+         < P o s t e d E n t r i e s H e a d e r L b l > P o s t e d E n t r i e s H e a d e r L b l < / P o s t e d E n t r i e s H e a d e r L b l > + 
+         < P o s t i n g D a t e C a p t i o n > P o s t i n g D a t e C a p t i o n < / P o s t i n g D a t e C a p t i o n > + 
+         < P o s t i n g D e s c r i p t i o n C a p t i o n > P o s t i n g D e s c r i p t i o n C a p t i o n < / P o s t i n g D e s c r i p t i o n C a p t i o n > + 
+         < P u r p o s e C a p t i o n > P u r p o s e C a p t i o n < / P u r p o s e C a p t i o n > + 
+         < R e p o r t L b l > R e p o r t L b l < / R e p o r t L b l > + 
+         < R e q u e s t e d B y C a p t i o n > R e q u e s t e d B y C a p t i o n < / R e q u e s t e d B y C a p t i o n > + 
+         < S t a t u s C a p t i o n > S t a t u s C a p t i o n < / S t a t u s C a p t i o n > + 
+         < T o t a l E x p e c t e d A m o u n t C a p t i o n > T o t a l E x p e c t e d A m o u n t C a p t i o n < / T o t a l E x p e c t e d A m o u n t C a p t i o n > + 
+         < T o t a l E x p e c t e d A m o u n t L C Y C a p t i o n > T o t a l E x p e c t e d A m o u n t L C Y C a p t i o n < / T o t a l E x p e c t e d A m o u n t L C Y C a p t i o n > + 
+         < T o t a l S p e n t A m o u n t C a p t i o n > T o t a l S p e n t A m o u n t C a p t i o n < / T o t a l S p e n t A m o u n t C a p t i o n >   
      < / L a b e l s >   
-     < T o o l t i p s   / > - 
-     < S p e n d R e q u e s t   E l e m e n t T y p e = " D a t a I t e m "   E l e m e n t I d = " 1 2 2 6 9 2 1 9 1 2 " > - 
-         < A p p r o v e d A t   E l e m e n t T y p e = " C o l u m n "   E l e m e n t I d = " 1 9 3 9 5 6 7 7 8 1 "   D a t a T y p e = " D a t e T i m e " > A p p r o v e d A t < / A p p r o v e d A t > - 
-         < A p p r o v e d B y U s e r N a m e   E l e m e n t T y p e = " C o l u m n "   E l e m e n t I d = " 1 7 2 2 9 6 4 0 6 1 "   D a t a T y p e = " C o d e " > A p p r o v e d B y U s e r N a m e < / A p p r o v e d B y U s e r N a m e > - 
-         < C u r r e n c y C o d e   E l e m e n t T y p e = " C o l u m n "   E l e m e n t I d = " 1 5 7 9 5 9 5 9 2 1 "   D a t a T y p e = " C o d e " > C u r r e n c y C o d e < / C u r r e n c y C o d e > - 
-         < D e t a i l s H e a d e r L b l   E l e m e n t T y p e = " C o l u m n "   E l e m e n t I d = " 1 5 6 2 3 0 7 8 7 8 "   D a t a T y p e = " T e x t C o n s t " > D e t a i l s H e a d e r L b l < / D e t a i l s H e a d e r L b l > - 
-         < E m p l o y e e F u l l N a m e L b l   E l e m e n t T y p e = " C o l u m n "   E l e m e n t I d = " 1 5 5 9 4 3 9 2 2 3 "   D a t a T y p e = " T e x t C o n s t " > E m p l o y e e F u l l N a m e L b l < / E m p l o y e e F u l l N a m e L b l > - 
-         < E m p l o y e e N a m e   E l e m e n t T y p e = " C o l u m n "   E l e m e n t I d = " 1 2 8 6 7 8 4 2 3 2 "   D a t a T y p e = " T e x t " > E m p l o y e e N a m e < / E m p l o y e e N a m e > - 
-         < E x p e c t e d E n d D a t e   E l e m e n t T y p e = " C o l u m n "   E l e m e n t I d = " 7 7 8 2 4 2 0 8 8 "   D a t a T y p e = " D a t e " > E x p e c t e d E n d D a t e < / E x p e c t e d E n d D a t e > - 
-         < E x p e c t e d S t a r t D a t e   E l e m e n t T y p e = " C o l u m n "   E l e m e n t I d = " 1 0 1 8 6 6 7 3 7 "   D a t a T y p e = " D a t e " > E x p e c t e d S t a r t D a t e < / E x p e c t e d S t a r t D a t e > - 
-         < G L A c c o u n t N o   E l e m e n t T y p e = " C o l u m n "   E l e m e n t I d = " 8 8 6 6 5 8 9 3 0 "   D a t a T y p e = " C o d e " > G L A c c o u n t N o < / G L A c c o u n t N o > - 
-         < N o   E l e m e n t T y p e = " C o l u m n "   E l e m e n t I d = " 1 1 9 8 2 6 8 3 4 0 "   D a t a T y p e = " C o d e " > N o < / N o > - 
-         < P o s t e d E n t r i e s H e a d e r L b l   E l e m e n t T y p e = " C o l u m n "   E l e m e n t I d = " 2 6 3 4 4 2 8 0 3 "   D a t a T y p e = " T e x t C o n s t " > P o s t e d E n t r i e s H e a d e r L b l < / P o s t e d E n t r i e s H e a d e r L b l > - 
-         < P u r p o s e   E l e m e n t T y p e = " C o l u m n "   E l e m e n t I d = " 3 1 3 1 5 8 9 0 9 "   D a t a T y p e = " T e x t " > P u r p o s e < / P u r p o s e > - 
-         < R e p o r t L b l   E l e m e n t T y p e = " C o l u m n "   E l e m e n t I d = " 4 6 0 2 0 4 4 3 1 "   D a t a T y p e = " T e x t C o n s t " > R e p o r t L b l < / R e p o r t L b l > - 
-         < R e q u e s t e d B y   E l e m e n t T y p e = " C o l u m n "   E l e m e n t I d = " 9 4 6 3 9 1 6 9 8 "   D a t a T y p e = " C o d e " > R e q u e s t e d B y < / R e q u e s t e d B y > - 
-         < S t a t u s   E l e m e n t T y p e = " C o l u m n "   E l e m e n t I d = " 1 6 3 4 1 4 4 5 5 1 "   D a t a T y p e = " O p t i o n " > S t a t u s < / S t a t u s > - 
-         < T o t a l E x p e c t e d A m o u n t   E l e m e n t T y p e = " C o l u m n "   E l e m e n t I d = " 1 8 9 2 8 2 9 1 7 3 "   D a t a T y p e = " D e c i m a l " > T o t a l E x p e c t e d A m o u n t < / T o t a l E x p e c t e d A m o u n t > - 
-         < T o t a l E x p e c t e d A m o u n t L C Y   E l e m e n t T y p e = " C o l u m n "   E l e m e n t I d = " 1 1 8 4 1 5 6 0 6 7 "   D a t a T y p e = " D e c i m a l " > T o t a l E x p e c t e d A m o u n t L C Y < / T o t a l E x p e c t e d A m o u n t L C Y > - 
-         < T o t a l S p e n t A m o u n t   E l e m e n t T y p e = " C o l u m n "   E l e m e n t I d = " 1 3 9 8 8 1 4 0 5 5 "   D a t a T y p e = " D e c i m a l " > T o t a l S p e n t A m o u n t < / T o t a l S p e n t A m o u n t > - 
-         < S p e n d R e q u e s t D e t a i l   E l e m e n t T y p e = " D a t a I t e m "   E l e m e n t I d = " 1 0 7 7 5 5 8 4 7 " > - 
-             < D e s c r i p t i o n   E l e m e n t T y p e = " C o l u m n "   E l e m e n t I d = " 1 3 1 4 3 5 1 3 0 7 "   D a t a T y p e = " T e x t " > D e s c r i p t i o n < / D e s c r i p t i o n > - 
-             < D e t a i l G L A c c o u n t N o   E l e m e n t T y p e = " C o l u m n "   E l e m e n t I d = " 6 9 2 9 9 7 5 9 3 "   D a t a T y p e = " C o d e " > D e t a i l G L A c c o u n t N o < / D e t a i l G L A c c o u n t N o > - 
-             < E x p e c t e d A m o u n t   E l e m e n t T y p e = " C o l u m n "   E l e m e n t I d = " 1 3 0 0 9 6 8 5 2 9 "   D a t a T y p e = " D e c i m a l " > E x p e c t e d A m o u n t < / E x p e c t e d A m o u n t > - 
-             < E x p e c t e d A m o u n t L C Y   E l e m e n t T y p e = " C o l u m n "   E l e m e n t I d = " 1 6 8 3 8 8 4 3 7 5 "   D a t a T y p e = " D e c i m a l " > E x p e c t e d A m o u n t L C Y < / E x p e c t e d A m o u n t L C Y > - 
-             < L i n e C u r r e n c y C o d e   E l e m e n t T y p e = " C o l u m n "   E l e m e n t I d = " 1 5 4 8 1 3 3 5 8 3 "   D a t a T y p e = " C o d e " > L i n e C u r r e n c y C o d e < / L i n e C u r r e n c y C o d e > - 
-             < L i n e N o   E l e m e n t T y p e = " C o l u m n "   E l e m e n t I d = " 9 8 1 5 1 4 5 2 6 "   D a t a T y p e = " I n t e g e r " > L i n e N o < / L i n e N o > +     < S p e n d R e q u e s t > + 
+         < A p p r o v e d A t > A p p r o v e d A t < / A p p r o v e d A t > + 
+         < A p p r o v e d B y U s e r N a m e > A p p r o v e d B y U s e r N a m e < / A p p r o v e d B y U s e r N a m e > + 
+         < C u r r e n c y C o d e > C u r r e n c y C o d e < / C u r r e n c y C o d e > + 
+         < E m p l o y e e N a m e > E m p l o y e e N a m e < / E m p l o y e e N a m e > + 
+         < E x p e c t e d E n d D a t e > E x p e c t e d E n d D a t e < / E x p e c t e d E n d D a t e > + 
+         < E x p e c t e d S t a r t D a t e > E x p e c t e d S t a r t D a t e < / E x p e c t e d S t a r t D a t e > + 
+         < G L A c c o u n t N o > G L A c c o u n t N o < / G L A c c o u n t N o > + 
+         < N o > N o < / N o > + 
+         < P u r p o s e > P u r p o s e < / P u r p o s e > + 
+         < R e q u e s t e d B y > R e q u e s t e d B y < / R e q u e s t e d B y > + 
+         < S t a t u s > S t a t u s < / S t a t u s > + 
+         < T o t a l E x p e c t e d A m o u n t > T o t a l E x p e c t e d A m o u n t < / T o t a l E x p e c t e d A m o u n t > + 
+         < T o t a l E x p e c t e d A m o u n t L C Y > T o t a l E x p e c t e d A m o u n t L C Y < / T o t a l E x p e c t e d A m o u n t L C Y > + 
+         < T o t a l S p e n t A m o u n t > T o t a l S p e n t A m o u n t < / T o t a l S p e n t A m o u n t > + 
+         < S p e n d R e q u e s t D e t a i l > + 
+             < D e s c r i p t i o n > D e s c r i p t i o n < / D e s c r i p t i o n > + 
+             < D e t a i l G L A c c o u n t N o > D e t a i l G L A c c o u n t N o < / D e t a i l G L A c c o u n t N o > + 
+             < E x p e c t e d A m o u n t > E x p e c t e d A m o u n t < / E x p e c t e d A m o u n t > + 
+             < E x p e c t e d A m o u n t L C Y > E x p e c t e d A m o u n t L C Y < / E x p e c t e d A m o u n t L C Y > + 
+             < L i n e C u r r e n c y C o d e > L i n e C u r r e n c y C o d e < / L i n e C u r r e n c y C o d e > + 
+             < L i n e N o > L i n e N o < / L i n e N o >   
          < / S p e n d R e q u e s t D e t a i l >   
-         < S p e n d R e q u e s t G L E n t r i e s   E l e m e n t T y p e = " D a t a I t e m "   E l e m e n t I d = " 9 3 4 1 0 6 3 8 5 " > - 
-             < G L A c c o u n t   E l e m e n t T y p e = " C o l u m n "   E l e m e n t I d = " 1 0 8 2 4 4 8 6 9 7 "   D a t a T y p e = " C o d e " > G L A c c o u n t < / G L A c c o u n t > - 
-             < P o s t e d A m o u n t   E l e m e n t T y p e = " C o l u m n "   E l e m e n t I d = " 9 6 0 3 0 2 3 1 2 "   D a t a T y p e = " D e c i m a l " > P o s t e d A m o u n t < / P o s t e d A m o u n t > - 
-             < P o s t e d D o c u m e n t N o   E l e m e n t T y p e = " C o l u m n "   E l e m e n t I d = " 1 3 3 5 5 3 9 9 4 "   D a t a T y p e = " C o d e " > P o s t e d D o c u m e n t N o < / P o s t e d D o c u m e n t N o > - 
-             < P o s t i n g D a t e   E l e m e n t T y p e = " C o l u m n "   E l e m e n t I d = " 8 8 9 9 5 5 3 3 7 "   D a t a T y p e = " D a t e " > P o s t i n g D a t e < / P o s t i n g D a t e > - 
-             < P o s t i n g D e s c r i p t i o n   E l e m e n t T y p e = " C o l u m n "   E l e m e n t I d = " 6 0 7 8 7 4 6 0 5 "   D a t a T y p e = " T e x t " > P o s t i n g D e s c r i p t i o n < / P o s t i n g D e s c r i p t i o n > +         < S p e n d R e q u e s t G L E n t r i e s > + 
+             < G L A c c o u n t > G L A c c o u n t < / G L A c c o u n t > + 
+             < P o s t e d A m o u n t > P o s t e d A m o u n t < / P o s t e d A m o u n t > + 
+             < P o s t e d D o c u m e n t N o > P o s t e d D o c u m e n t N o < / P o s t e d D o c u m e n t N o > + 
+             < P o s t i n g D a t e > P o s t i n g D a t e < / P o s t i n g D a t e > + 
+             < P o s t i n g D e s c r i p t i o n > P o s t i n g D e s c r i p t i o n < / P o s t i n g D e s c r i p t i o n >   
          < / S p e n d R e q u e s t G L E n t r i e s >   
@@ -3556,17 +3557,17 @@
 </file>
 
 <file path=customXml/itemProps1.xml><?xml version="1.0" encoding="utf-8"?>
-<ds:datastoreItem xmlns:ds="http://schemas.openxmlformats.org/officeDocument/2006/customXml" ds:itemID="{7828BD88-85FA-4D15-824F-B6C2963E083B}">
+<ds:datastoreItem xmlns:ds="http://schemas.openxmlformats.org/officeDocument/2006/customXml" ds:itemID="{0FA14807-1C08-4DEE-962E-4F4BB28529B6}">
   <ds:schemaRefs>
-    <ds:schemaRef ds:uri="urn:microsoft-dynamics-nav/reports/Spend_Request_Document/6850/"/>
+    <ds:schemaRef ds:uri="urn:microsoft-dynamics-businesscentral/internal/extended/reports/Spend_Request_Document/6850/"/>
   </ds:schemaRefs>
 </ds:datastoreItem>
 </file>
 
 <file path=customXml/itemProps2.xml><?xml version="1.0" encoding="utf-8"?>
-<ds:datastoreItem xmlns:ds="http://schemas.openxmlformats.org/officeDocument/2006/customXml" ds:itemID="{0FA14807-1C08-4DEE-962E-4F4BB28529B6}">
+<ds:datastoreItem xmlns:ds="http://schemas.openxmlformats.org/officeDocument/2006/customXml" ds:itemID="{7828BD88-85FA-4D15-824F-B6C2963E083B}">
   <ds:schemaRefs>
-    <ds:schemaRef ds:uri="urn:microsoft-dynamics-businesscentral/internal/extended/reports/Spend_Request_Document/6850/"/>
+    <ds:schemaRef ds:uri="urn:microsoft-dynamics-nav/reports/Spend_Request_Document/6850/"/>
   </ds:schemaRefs>
 </ds:datastoreItem>
 </file>

</xml_diff>